<commit_message>
fix: refine Word export wording and template migration
</commit_message>
<xml_diff>
--- a/word_templates/template.docx
+++ b/word_templates/template.docx
@@ -4,17 +4,17 @@
   <w:body>
     <w:p>
       <w:pPr>
-        <w:ind w:right="-253" w:left="-253"/>
+        <w:ind w:left="-253" w:right="-253"/>
         <w:jc w:val="center"/>
         <w:rPr>
-          <w:rFonts w:eastAsia="方正小标宋简体" w:hint="eastAsia"/>
+          <w:rFonts w:hint="eastAsia" w:eastAsia="方正小标宋简体"/>
           <w:sz w:val="56"/>
           <w:szCs w:val="56"/>
         </w:rPr>
       </w:pPr>
       <w:r>
         <w:rPr>
-          <w:rFonts w:eastAsia="方正小标宋简体" w:hint="eastAsia"/>
+          <w:rFonts w:hint="eastAsia" w:eastAsia="方正小标宋简体"/>
           <w:sz w:val="44"/>
           <w:szCs w:val="44"/>
         </w:rPr>
@@ -29,7 +29,7 @@
       </w:r>
       <w:r>
         <w:rPr>
-          <w:rFonts w:eastAsia="方正小标宋简体" w:hint="eastAsia"/>
+          <w:rFonts w:hint="eastAsia" w:eastAsia="方正小标宋简体"/>
           <w:sz w:val="44"/>
           <w:szCs w:val="44"/>
         </w:rPr>
@@ -38,7 +38,7 @@
     <w:p>
       <w:pPr>
         <w:shd w:val="clear" w:color="auto" w:fill="FFFFFF"/>
-        <w:ind w:right="-253" w:left="-253"/>
+        <w:ind w:left="-253" w:right="-253"/>
         <w:rPr>
           <w:rFonts w:eastAsia="仿宋_GB2312"/>
           <w:bCs/>
@@ -54,7 +54,7 @@
           <w:lang w:val="en-US" w:eastAsia="zh-CN"/>
         </w:rPr>
         <w:pict w14:anchorId="664512A9">
-          <v:line id="Line 2" o:spid="_x0000_s2050" style="position:absolute;left:0;text-align:left;flip:y;z-index:1;mso-wrap-style:square" from="-23.65pt,28.85pt" to="460.25pt,28.85pt" strokeweight="4.5pt">
+          <v:line id="Line 2" style="position:absolute;left:0;text-align:left;flip:y;z-index:1;mso-wrap-style:square" o:spid="_x0000_s2050" strokeweight="4.5pt" from="-23.65pt,28.85pt" to="460.25pt,28.85pt">
             <v:stroke linestyle="thickThin"/>
           </v:line>
         </w:pict>
@@ -106,23 +106,23 @@
       </w:r>
       <w:r>
         <w:rPr>
-          <w:rFonts w:eastAsia="仿宋_GB2312" w:hint="eastAsia"/>
-          <w:bCs/>
-          <w:sz w:val="32"/>
-          <w:szCs w:val="32"/>
-        </w:rPr>
-      </w:r>
-      <w:r>
-        <w:rPr>
-          <w:rFonts w:eastAsia="仿宋_GB2312"/>
-          <w:bCs/>
-          <w:sz w:val="32"/>
-          <w:szCs w:val="32"/>
-        </w:rPr>
-      </w:r>
-      <w:r>
-        <w:rPr>
-          <w:rFonts w:eastAsia="仿宋_GB2312" w:hint="eastAsia"/>
+          <w:rFonts w:hint="eastAsia" w:eastAsia="仿宋_GB2312"/>
+          <w:bCs/>
+          <w:sz w:val="32"/>
+          <w:szCs w:val="32"/>
+        </w:rPr>
+      </w:r>
+      <w:r>
+        <w:rPr>
+          <w:rFonts w:eastAsia="仿宋_GB2312"/>
+          <w:bCs/>
+          <w:sz w:val="32"/>
+          <w:szCs w:val="32"/>
+        </w:rPr>
+      </w:r>
+      <w:r>
+        <w:rPr>
+          <w:rFonts w:hint="eastAsia" w:eastAsia="仿宋_GB2312"/>
           <w:bCs/>
           <w:sz w:val="32"/>
           <w:szCs w:val="32"/>
@@ -141,17 +141,17 @@
       <w:pPr>
         <w:shd w:val="clear" w:color="auto" w:fill="FFFFFF"/>
         <w:spacing w:line="520" w:lineRule="exact"/>
-        <w:ind w:right="-253" w:left="-253"/>
-        <w:rPr>
-          <w:rFonts w:ascii="黑体" w:eastAsia="黑体" w:hAnsi="黑体" w:cs="黑体" w:hint="eastAsia"/>
-          <w:bCs/>
-          <w:sz w:val="32"/>
-          <w:szCs w:val="32"/>
-        </w:rPr>
-      </w:pPr>
-      <w:r>
-        <w:rPr>
-          <w:rFonts w:ascii="黑体" w:eastAsia="黑体" w:hAnsi="黑体" w:cs="黑体" w:hint="eastAsia"/>
+        <w:ind w:left="-253" w:right="-253"/>
+        <w:rPr>
+          <w:rFonts w:hint="eastAsia" w:ascii="黑体" w:hAnsi="黑体" w:eastAsia="黑体" w:cs="黑体"/>
+          <w:bCs/>
+          <w:sz w:val="32"/>
+          <w:szCs w:val="32"/>
+        </w:rPr>
+      </w:pPr>
+      <w:r>
+        <w:rPr>
+          <w:rFonts w:hint="eastAsia" w:ascii="黑体" w:hAnsi="黑体" w:eastAsia="黑体" w:cs="黑体"/>
           <w:bCs/>
           <w:sz w:val="32"/>
           <w:szCs w:val="32"/>
@@ -174,7 +174,7 @@
       </w:pPr>
       <w:r>
         <w:rPr>
-          <w:rFonts w:ascii="楷体_GB2312" w:eastAsia="楷体_GB2312" w:hAnsi="楷体_GB2312" w:cs="楷体_GB2312"/>
+          <w:rFonts w:ascii="楷体_GB2312" w:hAnsi="楷体_GB2312" w:eastAsia="楷体_GB2312" w:cs="楷体_GB2312"/>
           <w:bCs/>
           <w:sz w:val="32"/>
           <w:szCs w:val="32"/>
@@ -183,7 +183,7 @@
       </w:r>
       <w:r>
         <w:rPr>
-          <w:rFonts w:eastAsia="仿宋_GB2312" w:hint="eastAsia"/>
+          <w:rFonts w:hint="eastAsia" w:eastAsia="仿宋_GB2312"/>
           <w:bCs/>
           <w:sz w:val="32"/>
           <w:szCs w:val="32"/>
@@ -206,7 +206,7 @@
       </w:pPr>
       <w:r>
         <w:rPr>
-          <w:rFonts w:ascii="楷体_GB2312" w:eastAsia="楷体_GB2312" w:hAnsi="楷体_GB2312" w:cs="楷体_GB2312"/>
+          <w:rFonts w:ascii="楷体_GB2312" w:hAnsi="楷体_GB2312" w:eastAsia="楷体_GB2312" w:cs="楷体_GB2312"/>
           <w:bCs/>
           <w:sz w:val="32"/>
           <w:szCs w:val="32"/>
@@ -215,7 +215,7 @@
       </w:r>
       <w:r>
         <w:rPr>
-          <w:rFonts w:eastAsia="仿宋_GB2312" w:hint="eastAsia"/>
+          <w:rFonts w:hint="eastAsia" w:eastAsia="仿宋_GB2312"/>
           <w:bCs/>
           <w:sz w:val="32"/>
           <w:szCs w:val="32"/>
@@ -238,7 +238,7 @@
       </w:pPr>
       <w:r>
         <w:rPr>
-          <w:rFonts w:ascii="楷体_GB2312" w:eastAsia="楷体_GB2312" w:hAnsi="楷体_GB2312" w:cs="楷体_GB2312"/>
+          <w:rFonts w:ascii="楷体_GB2312" w:hAnsi="楷体_GB2312" w:eastAsia="楷体_GB2312" w:cs="楷体_GB2312"/>
           <w:bCs/>
           <w:sz w:val="32"/>
           <w:szCs w:val="32"/>
@@ -256,39 +256,39 @@
       </w:r>
       <w:r>
         <w:rPr>
-          <w:rFonts w:eastAsia="仿宋_GB2312" w:hint="eastAsia"/>
-          <w:bCs/>
-          <w:sz w:val="32"/>
-          <w:szCs w:val="32"/>
-        </w:rPr>
-      </w:r>
-      <w:r>
-        <w:rPr>
-          <w:rFonts w:eastAsia="仿宋_GB2312"/>
-          <w:bCs/>
-          <w:sz w:val="32"/>
-          <w:szCs w:val="32"/>
-        </w:rPr>
-      </w:r>
-      <w:r>
-        <w:rPr>
-          <w:rFonts w:eastAsia="仿宋_GB2312" w:hint="eastAsia"/>
-          <w:bCs/>
-          <w:sz w:val="32"/>
-          <w:szCs w:val="32"/>
-        </w:rPr>
-      </w:r>
-      <w:r>
-        <w:rPr>
-          <w:rFonts w:eastAsia="仿宋_GB2312"/>
-          <w:bCs/>
-          <w:sz w:val="32"/>
-          <w:szCs w:val="32"/>
-        </w:rPr>
-      </w:r>
-      <w:r>
-        <w:rPr>
-          <w:rFonts w:eastAsia="仿宋_GB2312" w:hint="eastAsia"/>
+          <w:rFonts w:hint="eastAsia" w:eastAsia="仿宋_GB2312"/>
+          <w:bCs/>
+          <w:sz w:val="32"/>
+          <w:szCs w:val="32"/>
+        </w:rPr>
+      </w:r>
+      <w:r>
+        <w:rPr>
+          <w:rFonts w:eastAsia="仿宋_GB2312"/>
+          <w:bCs/>
+          <w:sz w:val="32"/>
+          <w:szCs w:val="32"/>
+        </w:rPr>
+      </w:r>
+      <w:r>
+        <w:rPr>
+          <w:rFonts w:hint="eastAsia" w:eastAsia="仿宋_GB2312"/>
+          <w:bCs/>
+          <w:sz w:val="32"/>
+          <w:szCs w:val="32"/>
+        </w:rPr>
+      </w:r>
+      <w:r>
+        <w:rPr>
+          <w:rFonts w:eastAsia="仿宋_GB2312"/>
+          <w:bCs/>
+          <w:sz w:val="32"/>
+          <w:szCs w:val="32"/>
+        </w:rPr>
+      </w:r>
+      <w:r>
+        <w:rPr>
+          <w:rFonts w:hint="eastAsia" w:eastAsia="仿宋_GB2312"/>
           <w:bCs/>
           <w:sz w:val="32"/>
           <w:szCs w:val="32"/>
@@ -318,7 +318,7 @@
       </w:pPr>
       <w:r>
         <w:rPr>
-          <w:rFonts w:ascii="楷体_GB2312" w:eastAsia="楷体_GB2312" w:hAnsi="楷体_GB2312" w:cs="楷体_GB2312"/>
+          <w:rFonts w:ascii="楷体_GB2312" w:hAnsi="楷体_GB2312" w:eastAsia="楷体_GB2312" w:cs="楷体_GB2312"/>
           <w:bCs/>
           <w:sz w:val="32"/>
           <w:szCs w:val="32"/>
@@ -327,7 +327,7 @@
       </w:r>
       <w:r>
         <w:rPr>
-          <w:rFonts w:eastAsia="仿宋_GB2312" w:hint="eastAsia"/>
+          <w:rFonts w:hint="eastAsia" w:eastAsia="仿宋_GB2312"/>
           <w:bCs/>
           <w:sz w:val="32"/>
           <w:szCs w:val="32"/>
@@ -336,55 +336,55 @@
       </w:r>
       <w:r>
         <w:rPr>
-          <w:rFonts w:eastAsia="仿宋_GB2312" w:hint="eastAsia"/>
-          <w:bCs/>
-          <w:sz w:val="32"/>
-          <w:szCs w:val="32"/>
-        </w:rPr>
-      </w:r>
-      <w:r>
-        <w:rPr>
-          <w:rFonts w:eastAsia="仿宋_GB2312" w:hint="eastAsia"/>
-          <w:bCs/>
-          <w:sz w:val="32"/>
-          <w:szCs w:val="32"/>
-        </w:rPr>
-      </w:r>
-      <w:r>
-        <w:rPr>
-          <w:rFonts w:eastAsia="仿宋_GB2312" w:hint="eastAsia"/>
-          <w:bCs/>
-          <w:sz w:val="32"/>
-          <w:szCs w:val="32"/>
-        </w:rPr>
-      </w:r>
-      <w:r>
-        <w:rPr>
-          <w:rFonts w:eastAsia="仿宋_GB2312" w:hint="eastAsia"/>
-          <w:bCs/>
-          <w:sz w:val="32"/>
-          <w:szCs w:val="32"/>
-        </w:rPr>
-      </w:r>
-      <w:r>
-        <w:rPr>
-          <w:rFonts w:eastAsia="仿宋_GB2312" w:hint="eastAsia"/>
-          <w:bCs/>
-          <w:sz w:val="32"/>
-          <w:szCs w:val="32"/>
-        </w:rPr>
-      </w:r>
-      <w:r>
-        <w:rPr>
-          <w:rFonts w:eastAsia="仿宋_GB2312" w:hint="eastAsia"/>
-          <w:bCs/>
-          <w:sz w:val="32"/>
-          <w:szCs w:val="32"/>
-        </w:rPr>
-      </w:r>
-      <w:r>
-        <w:rPr>
-          <w:rFonts w:eastAsia="仿宋_GB2312" w:hint="eastAsia"/>
+          <w:rFonts w:hint="eastAsia" w:eastAsia="仿宋_GB2312"/>
+          <w:bCs/>
+          <w:sz w:val="32"/>
+          <w:szCs w:val="32"/>
+        </w:rPr>
+      </w:r>
+      <w:r>
+        <w:rPr>
+          <w:rFonts w:hint="eastAsia" w:eastAsia="仿宋_GB2312"/>
+          <w:bCs/>
+          <w:sz w:val="32"/>
+          <w:szCs w:val="32"/>
+        </w:rPr>
+      </w:r>
+      <w:r>
+        <w:rPr>
+          <w:rFonts w:hint="eastAsia" w:eastAsia="仿宋_GB2312"/>
+          <w:bCs/>
+          <w:sz w:val="32"/>
+          <w:szCs w:val="32"/>
+        </w:rPr>
+      </w:r>
+      <w:r>
+        <w:rPr>
+          <w:rFonts w:hint="eastAsia" w:eastAsia="仿宋_GB2312"/>
+          <w:bCs/>
+          <w:sz w:val="32"/>
+          <w:szCs w:val="32"/>
+        </w:rPr>
+      </w:r>
+      <w:r>
+        <w:rPr>
+          <w:rFonts w:hint="eastAsia" w:eastAsia="仿宋_GB2312"/>
+          <w:bCs/>
+          <w:sz w:val="32"/>
+          <w:szCs w:val="32"/>
+        </w:rPr>
+      </w:r>
+      <w:r>
+        <w:rPr>
+          <w:rFonts w:hint="eastAsia" w:eastAsia="仿宋_GB2312"/>
+          <w:bCs/>
+          <w:sz w:val="32"/>
+          <w:szCs w:val="32"/>
+        </w:rPr>
+      </w:r>
+      <w:r>
+        <w:rPr>
+          <w:rFonts w:hint="eastAsia" w:eastAsia="仿宋_GB2312"/>
           <w:bCs/>
           <w:sz w:val="32"/>
           <w:szCs w:val="32"/>
@@ -418,7 +418,7 @@
       </w:r>
       <w:r>
         <w:rPr>
-          <w:rFonts w:ascii="楷体_GB2312" w:eastAsia="楷体_GB2312" w:hAnsi="楷体_GB2312" w:cs="楷体_GB2312"/>
+          <w:rFonts w:ascii="楷体_GB2312" w:hAnsi="楷体_GB2312" w:eastAsia="楷体_GB2312" w:cs="楷体_GB2312"/>
           <w:bCs/>
           <w:sz w:val="32"/>
           <w:szCs w:val="32"/>
@@ -444,9 +444,9 @@
         <w:shd w:val="clear" w:color="auto" w:fill="FFFFFF"/>
         <w:wordWrap w:val="0"/>
         <w:spacing w:line="520" w:lineRule="exact"/>
-        <w:ind w:left="-43" w:right="-43" w:firstLineChars="100" w:firstLine="320"/>
-        <w:rPr>
-          <w:rFonts w:eastAsia="仿宋_GB2312" w:hint="eastAsia"/>
+        <w:ind w:left="-43" w:right="-43" w:firstLine="320" w:firstLineChars="100"/>
+        <w:rPr>
+          <w:rFonts w:hint="eastAsia" w:eastAsia="仿宋_GB2312"/>
           <w:bCs/>
           <w:sz w:val="32"/>
           <w:szCs w:val="32"/>
@@ -463,87 +463,87 @@
       </w:r>
       <w:r>
         <w:rPr>
-          <w:rFonts w:eastAsia="仿宋_GB2312" w:hint="eastAsia"/>
-          <w:bCs/>
-          <w:sz w:val="32"/>
-          <w:szCs w:val="32"/>
-        </w:rPr>
-      </w:r>
-      <w:r>
-        <w:rPr>
-          <w:rFonts w:eastAsia="仿宋_GB2312"/>
-          <w:bCs/>
-          <w:sz w:val="32"/>
-          <w:szCs w:val="32"/>
-        </w:rPr>
-      </w:r>
-      <w:r>
-        <w:rPr>
-          <w:rFonts w:eastAsia="仿宋_GB2312" w:hint="eastAsia"/>
-          <w:bCs/>
-          <w:sz w:val="32"/>
-          <w:szCs w:val="32"/>
-        </w:rPr>
-      </w:r>
-      <w:r>
-        <w:rPr>
-          <w:rFonts w:eastAsia="仿宋_GB2312" w:hint="eastAsia"/>
-          <w:bCs/>
-          <w:sz w:val="32"/>
-          <w:szCs w:val="32"/>
-        </w:rPr>
-      </w:r>
-      <w:r>
-        <w:rPr>
-          <w:rFonts w:eastAsia="仿宋_GB2312" w:hint="eastAsia"/>
-          <w:bCs/>
-          <w:sz w:val="32"/>
-          <w:szCs w:val="32"/>
-        </w:rPr>
-      </w:r>
-      <w:r>
-        <w:rPr>
-          <w:rFonts w:eastAsia="仿宋_GB2312" w:hint="eastAsia"/>
-          <w:bCs/>
-          <w:sz w:val="32"/>
-          <w:szCs w:val="32"/>
-        </w:rPr>
-      </w:r>
-      <w:r>
-        <w:rPr>
-          <w:rFonts w:eastAsia="仿宋_GB2312" w:hint="eastAsia"/>
-          <w:bCs/>
-          <w:sz w:val="32"/>
-          <w:szCs w:val="32"/>
-        </w:rPr>
-      </w:r>
-      <w:r>
-        <w:rPr>
-          <w:rFonts w:eastAsia="仿宋_GB2312" w:hint="eastAsia"/>
-          <w:bCs/>
-          <w:sz w:val="32"/>
-          <w:szCs w:val="32"/>
-        </w:rPr>
-      </w:r>
-      <w:r>
-        <w:rPr>
-          <w:rFonts w:eastAsia="仿宋_GB2312" w:hint="eastAsia"/>
-          <w:bCs/>
-          <w:sz w:val="32"/>
-          <w:szCs w:val="32"/>
-        </w:rPr>
-      </w:r>
-      <w:r>
-        <w:rPr>
-          <w:rFonts w:eastAsia="仿宋_GB2312"/>
-          <w:bCs/>
-          <w:sz w:val="32"/>
-          <w:szCs w:val="32"/>
-        </w:rPr>
-      </w:r>
-      <w:r>
-        <w:rPr>
-          <w:rFonts w:eastAsia="仿宋_GB2312" w:hint="eastAsia"/>
+          <w:rFonts w:hint="eastAsia" w:eastAsia="仿宋_GB2312"/>
+          <w:bCs/>
+          <w:sz w:val="32"/>
+          <w:szCs w:val="32"/>
+        </w:rPr>
+      </w:r>
+      <w:r>
+        <w:rPr>
+          <w:rFonts w:eastAsia="仿宋_GB2312"/>
+          <w:bCs/>
+          <w:sz w:val="32"/>
+          <w:szCs w:val="32"/>
+        </w:rPr>
+      </w:r>
+      <w:r>
+        <w:rPr>
+          <w:rFonts w:hint="eastAsia" w:eastAsia="仿宋_GB2312"/>
+          <w:bCs/>
+          <w:sz w:val="32"/>
+          <w:szCs w:val="32"/>
+        </w:rPr>
+      </w:r>
+      <w:r>
+        <w:rPr>
+          <w:rFonts w:hint="eastAsia" w:eastAsia="仿宋_GB2312"/>
+          <w:bCs/>
+          <w:sz w:val="32"/>
+          <w:szCs w:val="32"/>
+        </w:rPr>
+      </w:r>
+      <w:r>
+        <w:rPr>
+          <w:rFonts w:hint="eastAsia" w:eastAsia="仿宋_GB2312"/>
+          <w:bCs/>
+          <w:sz w:val="32"/>
+          <w:szCs w:val="32"/>
+        </w:rPr>
+      </w:r>
+      <w:r>
+        <w:rPr>
+          <w:rFonts w:hint="eastAsia" w:eastAsia="仿宋_GB2312"/>
+          <w:bCs/>
+          <w:sz w:val="32"/>
+          <w:szCs w:val="32"/>
+        </w:rPr>
+      </w:r>
+      <w:r>
+        <w:rPr>
+          <w:rFonts w:hint="eastAsia" w:eastAsia="仿宋_GB2312"/>
+          <w:bCs/>
+          <w:sz w:val="32"/>
+          <w:szCs w:val="32"/>
+        </w:rPr>
+      </w:r>
+      <w:r>
+        <w:rPr>
+          <w:rFonts w:hint="eastAsia" w:eastAsia="仿宋_GB2312"/>
+          <w:bCs/>
+          <w:sz w:val="32"/>
+          <w:szCs w:val="32"/>
+        </w:rPr>
+      </w:r>
+      <w:r>
+        <w:rPr>
+          <w:rFonts w:hint="eastAsia" w:eastAsia="仿宋_GB2312"/>
+          <w:bCs/>
+          <w:sz w:val="32"/>
+          <w:szCs w:val="32"/>
+        </w:rPr>
+      </w:r>
+      <w:r>
+        <w:rPr>
+          <w:rFonts w:eastAsia="仿宋_GB2312"/>
+          <w:bCs/>
+          <w:sz w:val="32"/>
+          <w:szCs w:val="32"/>
+        </w:rPr>
+      </w:r>
+      <w:r>
+        <w:rPr>
+          <w:rFonts w:hint="eastAsia" w:eastAsia="仿宋_GB2312"/>
           <w:bCs/>
           <w:sz w:val="32"/>
           <w:szCs w:val="32"/>
@@ -561,7 +561,7 @@
         <w:shd w:val="clear" w:color="auto" w:fill="FFFFFF"/>
         <w:wordWrap w:val="0"/>
         <w:spacing w:line="520" w:lineRule="exact"/>
-        <w:ind w:left="-43" w:right="-43" w:firstLineChars="100" w:firstLine="320"/>
+        <w:ind w:left="-43" w:right="-43" w:firstLine="320" w:firstLineChars="100"/>
         <w:rPr>
           <w:rFonts w:eastAsia="仿宋_GB2312"/>
           <w:bCs/>
@@ -580,71 +580,71 @@
       </w:r>
       <w:r>
         <w:rPr>
-          <w:rFonts w:eastAsia="仿宋_GB2312" w:hint="eastAsia"/>
-          <w:bCs/>
-          <w:sz w:val="32"/>
-          <w:szCs w:val="32"/>
-        </w:rPr>
-      </w:r>
-      <w:r>
-        <w:rPr>
-          <w:rFonts w:eastAsia="仿宋_GB2312"/>
-          <w:bCs/>
-          <w:sz w:val="32"/>
-          <w:szCs w:val="32"/>
-        </w:rPr>
-      </w:r>
-      <w:r>
-        <w:rPr>
-          <w:rFonts w:eastAsia="仿宋_GB2312" w:hint="eastAsia"/>
-          <w:bCs/>
-          <w:sz w:val="32"/>
-          <w:szCs w:val="32"/>
-        </w:rPr>
-      </w:r>
-      <w:r>
-        <w:rPr>
-          <w:rFonts w:eastAsia="仿宋_GB2312"/>
-          <w:bCs/>
-          <w:sz w:val="32"/>
-          <w:szCs w:val="32"/>
-        </w:rPr>
-      </w:r>
-      <w:r>
-        <w:rPr>
-          <w:rFonts w:eastAsia="仿宋_GB2312" w:hint="eastAsia"/>
-          <w:bCs/>
-          <w:sz w:val="32"/>
-          <w:szCs w:val="32"/>
-        </w:rPr>
-      </w:r>
-      <w:r>
-        <w:rPr>
-          <w:rFonts w:eastAsia="仿宋_GB2312" w:hint="eastAsia"/>
-          <w:bCs/>
-          <w:sz w:val="32"/>
-          <w:szCs w:val="32"/>
-        </w:rPr>
-      </w:r>
-      <w:r>
-        <w:rPr>
-          <w:rFonts w:eastAsia="仿宋_GB2312" w:hint="eastAsia"/>
-          <w:bCs/>
-          <w:sz w:val="32"/>
-          <w:szCs w:val="32"/>
-        </w:rPr>
-      </w:r>
-      <w:r>
-        <w:rPr>
-          <w:rFonts w:eastAsia="仿宋_GB2312"/>
-          <w:bCs/>
-          <w:sz w:val="32"/>
-          <w:szCs w:val="32"/>
-        </w:rPr>
-      </w:r>
-      <w:r>
-        <w:rPr>
-          <w:rFonts w:eastAsia="仿宋_GB2312" w:hint="eastAsia"/>
+          <w:rFonts w:hint="eastAsia" w:eastAsia="仿宋_GB2312"/>
+          <w:bCs/>
+          <w:sz w:val="32"/>
+          <w:szCs w:val="32"/>
+        </w:rPr>
+      </w:r>
+      <w:r>
+        <w:rPr>
+          <w:rFonts w:eastAsia="仿宋_GB2312"/>
+          <w:bCs/>
+          <w:sz w:val="32"/>
+          <w:szCs w:val="32"/>
+        </w:rPr>
+      </w:r>
+      <w:r>
+        <w:rPr>
+          <w:rFonts w:hint="eastAsia" w:eastAsia="仿宋_GB2312"/>
+          <w:bCs/>
+          <w:sz w:val="32"/>
+          <w:szCs w:val="32"/>
+        </w:rPr>
+      </w:r>
+      <w:r>
+        <w:rPr>
+          <w:rFonts w:eastAsia="仿宋_GB2312"/>
+          <w:bCs/>
+          <w:sz w:val="32"/>
+          <w:szCs w:val="32"/>
+        </w:rPr>
+      </w:r>
+      <w:r>
+        <w:rPr>
+          <w:rFonts w:hint="eastAsia" w:eastAsia="仿宋_GB2312"/>
+          <w:bCs/>
+          <w:sz w:val="32"/>
+          <w:szCs w:val="32"/>
+        </w:rPr>
+      </w:r>
+      <w:r>
+        <w:rPr>
+          <w:rFonts w:hint="eastAsia" w:eastAsia="仿宋_GB2312"/>
+          <w:bCs/>
+          <w:sz w:val="32"/>
+          <w:szCs w:val="32"/>
+        </w:rPr>
+      </w:r>
+      <w:r>
+        <w:rPr>
+          <w:rFonts w:hint="eastAsia" w:eastAsia="仿宋_GB2312"/>
+          <w:bCs/>
+          <w:sz w:val="32"/>
+          <w:szCs w:val="32"/>
+        </w:rPr>
+      </w:r>
+      <w:r>
+        <w:rPr>
+          <w:rFonts w:eastAsia="仿宋_GB2312"/>
+          <w:bCs/>
+          <w:sz w:val="32"/>
+          <w:szCs w:val="32"/>
+        </w:rPr>
+      </w:r>
+      <w:r>
+        <w:rPr>
+          <w:rFonts w:hint="eastAsia" w:eastAsia="仿宋_GB2312"/>
           <w:bCs/>
           <w:sz w:val="32"/>
           <w:szCs w:val="32"/>
@@ -667,7 +667,7 @@
       </w:pPr>
       <w:r>
         <w:rPr>
-          <w:rFonts w:ascii="楷体_GB2312" w:eastAsia="楷体_GB2312" w:hAnsi="楷体_GB2312" w:cs="楷体_GB2312"/>
+          <w:rFonts w:ascii="楷体_GB2312" w:hAnsi="楷体_GB2312" w:eastAsia="楷体_GB2312" w:cs="楷体_GB2312"/>
           <w:bCs/>
           <w:sz w:val="32"/>
           <w:szCs w:val="32"/>
@@ -699,7 +699,7 @@
       </w:pPr>
       <w:r>
         <w:rPr>
-          <w:rFonts w:ascii="楷体_GB2312" w:eastAsia="楷体_GB2312" w:hAnsi="楷体_GB2312" w:cs="楷体_GB2312"/>
+          <w:rFonts w:ascii="楷体_GB2312" w:hAnsi="楷体_GB2312" w:eastAsia="楷体_GB2312" w:cs="楷体_GB2312"/>
           <w:bCs/>
           <w:sz w:val="32"/>
           <w:szCs w:val="32"/>
@@ -717,159 +717,159 @@
       </w:r>
       <w:r>
         <w:rPr>
-          <w:rFonts w:eastAsia="仿宋_GB2312" w:hint="eastAsia"/>
-          <w:bCs/>
-          <w:sz w:val="32"/>
-          <w:szCs w:val="32"/>
-        </w:rPr>
-      </w:r>
-      <w:r>
-        <w:rPr>
-          <w:rFonts w:eastAsia="仿宋_GB2312"/>
-          <w:bCs/>
-          <w:sz w:val="32"/>
-          <w:szCs w:val="32"/>
-        </w:rPr>
-      </w:r>
-      <w:r>
-        <w:rPr>
-          <w:rFonts w:eastAsia="仿宋_GB2312" w:hint="eastAsia"/>
-          <w:bCs/>
-          <w:sz w:val="32"/>
-          <w:szCs w:val="32"/>
-        </w:rPr>
-      </w:r>
-      <w:r>
-        <w:rPr>
-          <w:rFonts w:eastAsia="仿宋_GB2312"/>
-          <w:bCs/>
-          <w:sz w:val="32"/>
-          <w:szCs w:val="32"/>
-        </w:rPr>
-      </w:r>
-      <w:r>
-        <w:rPr>
-          <w:rFonts w:eastAsia="仿宋_GB2312" w:hint="eastAsia"/>
-          <w:bCs/>
-          <w:sz w:val="32"/>
-          <w:szCs w:val="32"/>
-        </w:rPr>
-      </w:r>
-      <w:r>
-        <w:rPr>
-          <w:rFonts w:eastAsia="仿宋_GB2312"/>
-          <w:bCs/>
-          <w:sz w:val="32"/>
-          <w:szCs w:val="32"/>
-        </w:rPr>
-      </w:r>
-      <w:r>
-        <w:rPr>
-          <w:rFonts w:eastAsia="仿宋_GB2312" w:hint="eastAsia"/>
-          <w:bCs/>
-          <w:sz w:val="32"/>
-          <w:szCs w:val="32"/>
-        </w:rPr>
-      </w:r>
-      <w:r>
-        <w:rPr>
-          <w:rFonts w:eastAsia="仿宋_GB2312"/>
-          <w:bCs/>
-          <w:sz w:val="32"/>
-          <w:szCs w:val="32"/>
-        </w:rPr>
-      </w:r>
-      <w:r>
-        <w:rPr>
-          <w:rFonts w:eastAsia="仿宋_GB2312" w:hint="eastAsia"/>
-          <w:bCs/>
-          <w:sz w:val="32"/>
-          <w:szCs w:val="32"/>
-        </w:rPr>
-      </w:r>
-      <w:r>
-        <w:rPr>
-          <w:rFonts w:eastAsia="仿宋_GB2312"/>
-          <w:bCs/>
-          <w:sz w:val="32"/>
-          <w:szCs w:val="32"/>
-        </w:rPr>
-      </w:r>
-      <w:r>
-        <w:rPr>
-          <w:rFonts w:eastAsia="仿宋_GB2312"/>
-          <w:bCs/>
-          <w:sz w:val="32"/>
-          <w:szCs w:val="32"/>
-        </w:rPr>
-      </w:r>
-      <w:r>
-        <w:rPr>
-          <w:rFonts w:eastAsia="仿宋_GB2312" w:hint="eastAsia"/>
-          <w:bCs/>
-          <w:sz w:val="32"/>
-          <w:szCs w:val="32"/>
-        </w:rPr>
-      </w:r>
-      <w:r>
-        <w:rPr>
-          <w:rFonts w:eastAsia="仿宋_GB2312"/>
-          <w:bCs/>
-          <w:sz w:val="32"/>
-          <w:szCs w:val="32"/>
-        </w:rPr>
-      </w:r>
-      <w:r>
-        <w:rPr>
-          <w:rFonts w:eastAsia="仿宋_GB2312" w:hint="eastAsia"/>
-          <w:bCs/>
-          <w:sz w:val="32"/>
-          <w:szCs w:val="32"/>
-        </w:rPr>
-      </w:r>
-      <w:r>
-        <w:rPr>
-          <w:rFonts w:eastAsia="仿宋_GB2312" w:hint="eastAsia"/>
-          <w:bCs/>
-          <w:sz w:val="32"/>
-          <w:szCs w:val="32"/>
-        </w:rPr>
-      </w:r>
-      <w:r>
-        <w:rPr>
-          <w:rFonts w:eastAsia="仿宋_GB2312" w:hint="eastAsia"/>
-          <w:bCs/>
-          <w:sz w:val="32"/>
-          <w:szCs w:val="32"/>
-        </w:rPr>
-      </w:r>
-      <w:r>
-        <w:rPr>
-          <w:rFonts w:eastAsia="仿宋_GB2312"/>
-          <w:bCs/>
-          <w:sz w:val="32"/>
-          <w:szCs w:val="32"/>
-        </w:rPr>
-      </w:r>
-      <w:r>
-        <w:rPr>
-          <w:rFonts w:eastAsia="仿宋_GB2312" w:hint="eastAsia"/>
-          <w:bCs/>
-          <w:sz w:val="32"/>
-          <w:szCs w:val="32"/>
-        </w:rPr>
-      </w:r>
-      <w:r>
-        <w:rPr>
-          <w:rFonts w:eastAsia="仿宋_GB2312"/>
-          <w:bCs/>
-          <w:sz w:val="32"/>
-          <w:szCs w:val="32"/>
-        </w:rPr>
-      </w:r>
-      <w:r>
-        <w:rPr>
-          <w:rFonts w:eastAsia="仿宋_GB2312" w:hint="eastAsia"/>
+          <w:rFonts w:hint="eastAsia" w:eastAsia="仿宋_GB2312"/>
+          <w:bCs/>
+          <w:sz w:val="32"/>
+          <w:szCs w:val="32"/>
+        </w:rPr>
+      </w:r>
+      <w:r>
+        <w:rPr>
+          <w:rFonts w:eastAsia="仿宋_GB2312"/>
+          <w:bCs/>
+          <w:sz w:val="32"/>
+          <w:szCs w:val="32"/>
+        </w:rPr>
+      </w:r>
+      <w:r>
+        <w:rPr>
+          <w:rFonts w:hint="eastAsia" w:eastAsia="仿宋_GB2312"/>
+          <w:bCs/>
+          <w:sz w:val="32"/>
+          <w:szCs w:val="32"/>
+        </w:rPr>
+      </w:r>
+      <w:r>
+        <w:rPr>
+          <w:rFonts w:eastAsia="仿宋_GB2312"/>
+          <w:bCs/>
+          <w:sz w:val="32"/>
+          <w:szCs w:val="32"/>
+        </w:rPr>
+      </w:r>
+      <w:r>
+        <w:rPr>
+          <w:rFonts w:hint="eastAsia" w:eastAsia="仿宋_GB2312"/>
+          <w:bCs/>
+          <w:sz w:val="32"/>
+          <w:szCs w:val="32"/>
+        </w:rPr>
+      </w:r>
+      <w:r>
+        <w:rPr>
+          <w:rFonts w:eastAsia="仿宋_GB2312"/>
+          <w:bCs/>
+          <w:sz w:val="32"/>
+          <w:szCs w:val="32"/>
+        </w:rPr>
+      </w:r>
+      <w:r>
+        <w:rPr>
+          <w:rFonts w:hint="eastAsia" w:eastAsia="仿宋_GB2312"/>
+          <w:bCs/>
+          <w:sz w:val="32"/>
+          <w:szCs w:val="32"/>
+        </w:rPr>
+      </w:r>
+      <w:r>
+        <w:rPr>
+          <w:rFonts w:eastAsia="仿宋_GB2312"/>
+          <w:bCs/>
+          <w:sz w:val="32"/>
+          <w:szCs w:val="32"/>
+        </w:rPr>
+      </w:r>
+      <w:r>
+        <w:rPr>
+          <w:rFonts w:hint="eastAsia" w:eastAsia="仿宋_GB2312"/>
+          <w:bCs/>
+          <w:sz w:val="32"/>
+          <w:szCs w:val="32"/>
+        </w:rPr>
+      </w:r>
+      <w:r>
+        <w:rPr>
+          <w:rFonts w:eastAsia="仿宋_GB2312"/>
+          <w:bCs/>
+          <w:sz w:val="32"/>
+          <w:szCs w:val="32"/>
+        </w:rPr>
+      </w:r>
+      <w:r>
+        <w:rPr>
+          <w:rFonts w:eastAsia="仿宋_GB2312"/>
+          <w:bCs/>
+          <w:sz w:val="32"/>
+          <w:szCs w:val="32"/>
+        </w:rPr>
+      </w:r>
+      <w:r>
+        <w:rPr>
+          <w:rFonts w:hint="eastAsia" w:eastAsia="仿宋_GB2312"/>
+          <w:bCs/>
+          <w:sz w:val="32"/>
+          <w:szCs w:val="32"/>
+        </w:rPr>
+      </w:r>
+      <w:r>
+        <w:rPr>
+          <w:rFonts w:eastAsia="仿宋_GB2312"/>
+          <w:bCs/>
+          <w:sz w:val="32"/>
+          <w:szCs w:val="32"/>
+        </w:rPr>
+      </w:r>
+      <w:r>
+        <w:rPr>
+          <w:rFonts w:hint="eastAsia" w:eastAsia="仿宋_GB2312"/>
+          <w:bCs/>
+          <w:sz w:val="32"/>
+          <w:szCs w:val="32"/>
+        </w:rPr>
+      </w:r>
+      <w:r>
+        <w:rPr>
+          <w:rFonts w:hint="eastAsia" w:eastAsia="仿宋_GB2312"/>
+          <w:bCs/>
+          <w:sz w:val="32"/>
+          <w:szCs w:val="32"/>
+        </w:rPr>
+      </w:r>
+      <w:r>
+        <w:rPr>
+          <w:rFonts w:hint="eastAsia" w:eastAsia="仿宋_GB2312"/>
+          <w:bCs/>
+          <w:sz w:val="32"/>
+          <w:szCs w:val="32"/>
+        </w:rPr>
+      </w:r>
+      <w:r>
+        <w:rPr>
+          <w:rFonts w:eastAsia="仿宋_GB2312"/>
+          <w:bCs/>
+          <w:sz w:val="32"/>
+          <w:szCs w:val="32"/>
+        </w:rPr>
+      </w:r>
+      <w:r>
+        <w:rPr>
+          <w:rFonts w:hint="eastAsia" w:eastAsia="仿宋_GB2312"/>
+          <w:bCs/>
+          <w:sz w:val="32"/>
+          <w:szCs w:val="32"/>
+        </w:rPr>
+      </w:r>
+      <w:r>
+        <w:rPr>
+          <w:rFonts w:eastAsia="仿宋_GB2312"/>
+          <w:bCs/>
+          <w:sz w:val="32"/>
+          <w:szCs w:val="32"/>
+        </w:rPr>
+      </w:r>
+      <w:r>
+        <w:rPr>
+          <w:rFonts w:hint="eastAsia" w:eastAsia="仿宋_GB2312"/>
           <w:bCs/>
           <w:sz w:val="32"/>
           <w:szCs w:val="32"/>
@@ -903,7 +903,7 @@
       </w:pPr>
       <w:r>
         <w:rPr>
-          <w:rFonts w:ascii="楷体_GB2312" w:eastAsia="楷体_GB2312" w:hAnsi="楷体_GB2312" w:cs="楷体_GB2312"/>
+          <w:rFonts w:ascii="楷体_GB2312" w:hAnsi="楷体_GB2312" w:eastAsia="楷体_GB2312" w:cs="楷体_GB2312"/>
           <w:bCs/>
           <w:sz w:val="32"/>
           <w:szCs w:val="32"/>
@@ -1025,7 +1025,7 @@
       </w:r>
       <w:r>
         <w:rPr>
-          <w:rFonts w:eastAsia="仿宋_GB2312" w:hint="eastAsia"/>
+          <w:rFonts w:hint="eastAsia" w:eastAsia="仿宋_GB2312"/>
           <w:bCs/>
           <w:sz w:val="32"/>
           <w:szCs w:val="32"/>
@@ -1071,7 +1071,7 @@
       </w:pPr>
       <w:r>
         <w:rPr>
-          <w:rFonts w:ascii="楷体_GB2312" w:eastAsia="楷体_GB2312" w:hAnsi="楷体_GB2312" w:cs="楷体_GB2312"/>
+          <w:rFonts w:ascii="楷体_GB2312" w:hAnsi="楷体_GB2312" w:eastAsia="楷体_GB2312" w:cs="楷体_GB2312"/>
           <w:bCs/>
           <w:sz w:val="32"/>
           <w:szCs w:val="32"/>
@@ -1089,7 +1089,7 @@
       </w:r>
       <w:r>
         <w:rPr>
-          <w:rFonts w:eastAsia="仿宋_GB2312" w:hint="eastAsia"/>
+          <w:rFonts w:hint="eastAsia" w:eastAsia="仿宋_GB2312"/>
           <w:bCs/>
           <w:sz w:val="32"/>
           <w:szCs w:val="32"/>
@@ -1109,17 +1109,17 @@
       <w:pPr>
         <w:shd w:val="clear" w:color="auto" w:fill="FFFFFF"/>
         <w:spacing w:line="520" w:lineRule="exact"/>
-        <w:ind w:right="-253" w:left="-253"/>
-        <w:rPr>
-          <w:rFonts w:ascii="黑体" w:eastAsia="黑体" w:hAnsi="黑体" w:cs="黑体"/>
-          <w:bCs/>
-          <w:sz w:val="32"/>
-          <w:szCs w:val="32"/>
-        </w:rPr>
-      </w:pPr>
-      <w:r>
-        <w:rPr>
-          <w:rFonts w:ascii="黑体" w:eastAsia="黑体" w:hAnsi="黑体" w:cs="黑体"/>
+        <w:ind w:left="-253" w:right="-253"/>
+        <w:rPr>
+          <w:rFonts w:ascii="黑体" w:hAnsi="黑体" w:eastAsia="黑体" w:cs="黑体"/>
+          <w:bCs/>
+          <w:sz w:val="32"/>
+          <w:szCs w:val="32"/>
+        </w:rPr>
+      </w:pPr>
+      <w:r>
+        <w:rPr>
+          <w:rFonts w:ascii="黑体" w:hAnsi="黑体" w:eastAsia="黑体" w:cs="黑体"/>
           <w:bCs/>
           <w:sz w:val="32"/>
           <w:szCs w:val="32"/>
@@ -1134,15 +1134,15 @@
         <w:spacing w:line="520" w:lineRule="exact"/>
         <w:ind w:left="-43" w:right="-43"/>
         <w:rPr>
-          <w:rFonts w:ascii="楷体_GB2312" w:eastAsia="楷体_GB2312" w:hAnsi="楷体_GB2312" w:cs="楷体_GB2312"/>
-          <w:bCs/>
-          <w:sz w:val="32"/>
-          <w:szCs w:val="32"/>
-        </w:rPr>
-      </w:pPr>
-      <w:r>
-        <w:rPr>
-          <w:rFonts w:ascii="楷体_GB2312" w:eastAsia="楷体_GB2312" w:hAnsi="楷体_GB2312" w:cs="楷体_GB2312"/>
+          <w:rFonts w:ascii="楷体_GB2312" w:hAnsi="楷体_GB2312" w:eastAsia="楷体_GB2312" w:cs="楷体_GB2312"/>
+          <w:bCs/>
+          <w:sz w:val="32"/>
+          <w:szCs w:val="32"/>
+        </w:rPr>
+      </w:pPr>
+      <w:r>
+        <w:rPr>
+          <w:rFonts w:ascii="楷体_GB2312" w:hAnsi="楷体_GB2312" w:eastAsia="楷体_GB2312" w:cs="楷体_GB2312"/>
           <w:bCs/>
           <w:sz w:val="32"/>
           <w:szCs w:val="32"/>
@@ -1155,7 +1155,7 @@
         <w:shd w:val="clear" w:color="auto" w:fill="FFFFFF"/>
         <w:wordWrap w:val="0"/>
         <w:spacing w:line="520" w:lineRule="exact"/>
-        <w:ind w:right="-253" w:firstLineChars="200" w:firstLine="640" w:left="-253"/>
+        <w:ind w:left="-253" w:right="-253" w:firstLine="640" w:firstLineChars="200"/>
         <w:rPr>
           <w:rFonts w:eastAsia="仿宋_GB2312"/>
           <w:bCs/>
@@ -1204,15 +1204,15 @@
         <w:spacing w:line="520" w:lineRule="exact"/>
         <w:ind w:left="-43" w:right="-43"/>
         <w:rPr>
-          <w:rFonts w:ascii="楷体_GB2312" w:eastAsia="楷体_GB2312" w:hAnsi="楷体_GB2312" w:cs="楷体_GB2312"/>
-          <w:bCs/>
-          <w:sz w:val="32"/>
-          <w:szCs w:val="32"/>
-        </w:rPr>
-      </w:pPr>
-      <w:r>
-        <w:rPr>
-          <w:rFonts w:ascii="楷体_GB2312" w:eastAsia="楷体_GB2312" w:hAnsi="楷体_GB2312" w:cs="楷体_GB2312"/>
+          <w:rFonts w:ascii="楷体_GB2312" w:hAnsi="楷体_GB2312" w:eastAsia="楷体_GB2312" w:cs="楷体_GB2312"/>
+          <w:bCs/>
+          <w:sz w:val="32"/>
+          <w:szCs w:val="32"/>
+        </w:rPr>
+      </w:pPr>
+      <w:r>
+        <w:rPr>
+          <w:rFonts w:ascii="楷体_GB2312" w:hAnsi="楷体_GB2312" w:eastAsia="楷体_GB2312" w:cs="楷体_GB2312"/>
           <w:bCs/>
           <w:sz w:val="32"/>
           <w:szCs w:val="32"/>
@@ -1225,7 +1225,7 @@
         <w:shd w:val="clear" w:color="auto" w:fill="FFFFFF"/>
         <w:wordWrap w:val="0"/>
         <w:spacing w:line="520" w:lineRule="exact"/>
-        <w:ind w:left="-43" w:right="-43" w:firstLineChars="100" w:firstLine="320"/>
+        <w:ind w:left="-43" w:right="-43" w:firstLine="320" w:firstLineChars="100"/>
         <w:rPr>
           <w:rFonts w:eastAsia="仿宋_GB2312"/>
           <w:bCs/>
@@ -1291,7 +1291,7 @@
         <w:shd w:val="clear" w:color="auto" w:fill="FFFFFF"/>
         <w:wordWrap w:val="0"/>
         <w:spacing w:line="520" w:lineRule="exact"/>
-        <w:ind w:left="-43" w:right="-43" w:firstLineChars="100" w:firstLine="320"/>
+        <w:ind w:left="-43" w:right="-43" w:firstLine="320" w:firstLineChars="100"/>
         <w:rPr>
           <w:rFonts w:eastAsia="仿宋_GB2312"/>
           <w:bCs/>
@@ -1439,17 +1439,17 @@
         </w:tabs>
         <w:wordWrap w:val="0"/>
         <w:spacing w:line="520" w:lineRule="exact"/>
-        <w:ind w:right="-43" w:left="-43"/>
-        <w:rPr>
-          <w:rFonts w:eastAsia="仿宋_GB2312"/>
-          <w:bCs/>
-          <w:sz w:val="32"/>
-          <w:szCs w:val="32"/>
-        </w:rPr>
-      </w:pPr>
-      <w:r>
-        <w:rPr>
-          <w:rFonts w:ascii="楷体_GB2312" w:eastAsia="楷体_GB2312" w:hAnsi="楷体_GB2312" w:cs="楷体_GB2312"/>
+        <w:ind w:left="-43" w:right="-43"/>
+        <w:rPr>
+          <w:rFonts w:eastAsia="仿宋_GB2312"/>
+          <w:bCs/>
+          <w:sz w:val="32"/>
+          <w:szCs w:val="32"/>
+        </w:rPr>
+      </w:pPr>
+      <w:r>
+        <w:rPr>
+          <w:rFonts w:ascii="楷体_GB2312" w:hAnsi="楷体_GB2312" w:eastAsia="楷体_GB2312" w:cs="楷体_GB2312"/>
           <w:bCs/>
           <w:sz w:val="32"/>
           <w:szCs w:val="32"/>
@@ -1458,7 +1458,7 @@
       </w:r>
       <w:r>
         <w:rPr>
-          <w:rFonts w:ascii="楷体_GB2312" w:eastAsia="楷体_GB2312" w:hAnsi="楷体_GB2312" w:cs="楷体_GB2312"/>
+          <w:rFonts w:ascii="楷体_GB2312" w:hAnsi="楷体_GB2312" w:eastAsia="楷体_GB2312" w:cs="楷体_GB2312"/>
           <w:bCs/>
           <w:sz w:val="32"/>
           <w:szCs w:val="32"/>
@@ -1480,7 +1480,7 @@
         <w:shd w:val="clear" w:color="auto" w:fill="FFFFFF"/>
         <w:wordWrap w:val="0"/>
         <w:spacing w:line="520" w:lineRule="exact"/>
-        <w:ind w:left="-43" w:right="-43" w:firstLineChars="100" w:firstLine="320"/>
+        <w:ind w:left="-43" w:right="-43" w:firstLine="320" w:firstLineChars="100"/>
         <w:rPr>
           <w:rFonts w:eastAsia="仿宋_GB2312"/>
           <w:bCs/>
@@ -1524,87 +1524,87 @@
       </w:r>
       <w:r>
         <w:rPr>
-          <w:rFonts w:eastAsia="仿宋_GB2312" w:hint="eastAsia"/>
-          <w:bCs/>
-          <w:sz w:val="32"/>
-          <w:szCs w:val="32"/>
-        </w:rPr>
-      </w:r>
-      <w:r>
-        <w:rPr>
-          <w:rFonts w:eastAsia="仿宋_GB2312" w:hint="eastAsia"/>
-          <w:bCs/>
-          <w:sz w:val="32"/>
-          <w:szCs w:val="32"/>
-        </w:rPr>
-      </w:r>
-      <w:r>
-        <w:rPr>
-          <w:rFonts w:eastAsia="仿宋_GB2312" w:hint="eastAsia"/>
-          <w:bCs/>
-          <w:sz w:val="32"/>
-          <w:szCs w:val="32"/>
-        </w:rPr>
-      </w:r>
-      <w:r>
-        <w:rPr>
-          <w:rFonts w:eastAsia="仿宋_GB2312" w:hint="eastAsia"/>
-          <w:bCs/>
-          <w:sz w:val="32"/>
-          <w:szCs w:val="32"/>
-        </w:rPr>
-      </w:r>
-      <w:r>
-        <w:rPr>
-          <w:rFonts w:eastAsia="仿宋_GB2312" w:hint="eastAsia"/>
-          <w:bCs/>
-          <w:sz w:val="32"/>
-          <w:szCs w:val="32"/>
-        </w:rPr>
-      </w:r>
-      <w:r>
-        <w:rPr>
-          <w:rFonts w:eastAsia="仿宋_GB2312" w:hint="eastAsia"/>
-          <w:bCs/>
-          <w:sz w:val="32"/>
-          <w:szCs w:val="32"/>
-        </w:rPr>
-      </w:r>
-      <w:r>
-        <w:rPr>
-          <w:rFonts w:eastAsia="仿宋_GB2312" w:hint="eastAsia"/>
-          <w:bCs/>
-          <w:sz w:val="32"/>
-          <w:szCs w:val="32"/>
-        </w:rPr>
-      </w:r>
-      <w:r>
-        <w:rPr>
-          <w:rFonts w:eastAsia="仿宋_GB2312"/>
-          <w:bCs/>
-          <w:sz w:val="32"/>
-          <w:szCs w:val="32"/>
-        </w:rPr>
-      </w:r>
-      <w:r>
-        <w:rPr>
-          <w:rFonts w:eastAsia="仿宋_GB2312"/>
-          <w:bCs/>
-          <w:sz w:val="32"/>
-          <w:szCs w:val="32"/>
-        </w:rPr>
-      </w:r>
-      <w:r>
-        <w:rPr>
-          <w:rFonts w:eastAsia="仿宋_GB2312" w:hint="eastAsia"/>
-          <w:bCs/>
-          <w:sz w:val="32"/>
-          <w:szCs w:val="32"/>
-        </w:rPr>
-      </w:r>
-      <w:r>
-        <w:rPr>
-          <w:rFonts w:eastAsia="仿宋_GB2312" w:hint="eastAsia"/>
+          <w:rFonts w:hint="eastAsia" w:eastAsia="仿宋_GB2312"/>
+          <w:bCs/>
+          <w:sz w:val="32"/>
+          <w:szCs w:val="32"/>
+        </w:rPr>
+      </w:r>
+      <w:r>
+        <w:rPr>
+          <w:rFonts w:hint="eastAsia" w:eastAsia="仿宋_GB2312"/>
+          <w:bCs/>
+          <w:sz w:val="32"/>
+          <w:szCs w:val="32"/>
+        </w:rPr>
+      </w:r>
+      <w:r>
+        <w:rPr>
+          <w:rFonts w:hint="eastAsia" w:eastAsia="仿宋_GB2312"/>
+          <w:bCs/>
+          <w:sz w:val="32"/>
+          <w:szCs w:val="32"/>
+        </w:rPr>
+      </w:r>
+      <w:r>
+        <w:rPr>
+          <w:rFonts w:hint="eastAsia" w:eastAsia="仿宋_GB2312"/>
+          <w:bCs/>
+          <w:sz w:val="32"/>
+          <w:szCs w:val="32"/>
+        </w:rPr>
+      </w:r>
+      <w:r>
+        <w:rPr>
+          <w:rFonts w:hint="eastAsia" w:eastAsia="仿宋_GB2312"/>
+          <w:bCs/>
+          <w:sz w:val="32"/>
+          <w:szCs w:val="32"/>
+        </w:rPr>
+      </w:r>
+      <w:r>
+        <w:rPr>
+          <w:rFonts w:hint="eastAsia" w:eastAsia="仿宋_GB2312"/>
+          <w:bCs/>
+          <w:sz w:val="32"/>
+          <w:szCs w:val="32"/>
+        </w:rPr>
+      </w:r>
+      <w:r>
+        <w:rPr>
+          <w:rFonts w:hint="eastAsia" w:eastAsia="仿宋_GB2312"/>
+          <w:bCs/>
+          <w:sz w:val="32"/>
+          <w:szCs w:val="32"/>
+        </w:rPr>
+      </w:r>
+      <w:r>
+        <w:rPr>
+          <w:rFonts w:eastAsia="仿宋_GB2312"/>
+          <w:bCs/>
+          <w:sz w:val="32"/>
+          <w:szCs w:val="32"/>
+        </w:rPr>
+      </w:r>
+      <w:r>
+        <w:rPr>
+          <w:rFonts w:eastAsia="仿宋_GB2312"/>
+          <w:bCs/>
+          <w:sz w:val="32"/>
+          <w:szCs w:val="32"/>
+        </w:rPr>
+      </w:r>
+      <w:r>
+        <w:rPr>
+          <w:rFonts w:hint="eastAsia" w:eastAsia="仿宋_GB2312"/>
+          <w:bCs/>
+          <w:sz w:val="32"/>
+          <w:szCs w:val="32"/>
+        </w:rPr>
+      </w:r>
+      <w:r>
+        <w:rPr>
+          <w:rFonts w:hint="eastAsia" w:eastAsia="仿宋_GB2312"/>
           <w:bCs/>
           <w:sz w:val="32"/>
           <w:szCs w:val="32"/>
@@ -1617,7 +1617,7 @@
         <w:shd w:val="clear" w:color="auto" w:fill="FFFFFF"/>
         <w:wordWrap w:val="0"/>
         <w:spacing w:line="520" w:lineRule="exact"/>
-        <w:ind w:left="-43" w:right="-43" w:firstLineChars="100" w:firstLine="320"/>
+        <w:ind w:left="-43" w:right="-43" w:firstLine="320" w:firstLineChars="100"/>
         <w:rPr>
           <w:rFonts w:eastAsia="仿宋_GB2312"/>
           <w:bCs/>
@@ -1653,7 +1653,7 @@
       </w:r>
       <w:r>
         <w:rPr>
-          <w:rFonts w:eastAsia="仿宋_GB2312" w:hint="eastAsia"/>
+          <w:rFonts w:hint="eastAsia" w:eastAsia="仿宋_GB2312"/>
           <w:bCs/>
           <w:sz w:val="32"/>
           <w:szCs w:val="32"/>
@@ -1674,7 +1674,7 @@
         <w:shd w:val="clear" w:color="auto" w:fill="FFFFFF"/>
         <w:wordWrap w:val="0"/>
         <w:spacing w:line="520" w:lineRule="exact"/>
-        <w:ind w:left="-43" w:right="-43" w:firstLineChars="100" w:firstLine="320"/>
+        <w:ind w:left="-43" w:right="-43" w:firstLine="320" w:firstLineChars="100"/>
         <w:rPr>
           <w:rFonts w:eastAsia="仿宋_GB2312"/>
           <w:bCs/>
@@ -1755,7 +1755,7 @@
         <w:shd w:val="clear" w:color="auto" w:fill="FFFFFF"/>
         <w:wordWrap w:val="0"/>
         <w:spacing w:line="520" w:lineRule="exact"/>
-        <w:ind w:left="-43" w:right="-43" w:firstLineChars="100" w:firstLine="320"/>
+        <w:ind w:left="-43" w:right="-43" w:firstLine="320" w:firstLineChars="100"/>
         <w:rPr>
           <w:rFonts w:eastAsia="仿宋_GB2312"/>
           <w:bCs/>
@@ -1871,7 +1871,7 @@
       </w:r>
       <w:r>
         <w:rPr>
-          <w:rFonts w:eastAsia="仿宋_GB2312" w:hint="eastAsia"/>
+          <w:rFonts w:hint="eastAsia" w:eastAsia="仿宋_GB2312"/>
           <w:bCs/>
           <w:sz w:val="32"/>
           <w:szCs w:val="32"/>
@@ -1895,17 +1895,17 @@
         </w:tabs>
         <w:wordWrap w:val="0"/>
         <w:spacing w:line="520" w:lineRule="exact"/>
-        <w:ind w:right="-43" w:left="-43"/>
-        <w:rPr>
-          <w:rFonts w:eastAsia="仿宋_GB2312"/>
-          <w:bCs/>
-          <w:sz w:val="32"/>
-          <w:szCs w:val="32"/>
-        </w:rPr>
-      </w:pPr>
-      <w:r>
-        <w:rPr>
-          <w:rFonts w:ascii="楷体_GB2312" w:eastAsia="楷体_GB2312" w:hAnsi="楷体_GB2312" w:cs="楷体_GB2312"/>
+        <w:ind w:left="-43" w:right="-43"/>
+        <w:rPr>
+          <w:rFonts w:eastAsia="仿宋_GB2312"/>
+          <w:bCs/>
+          <w:sz w:val="32"/>
+          <w:szCs w:val="32"/>
+        </w:rPr>
+      </w:pPr>
+      <w:r>
+        <w:rPr>
+          <w:rFonts w:ascii="楷体_GB2312" w:hAnsi="楷体_GB2312" w:eastAsia="楷体_GB2312" w:cs="楷体_GB2312"/>
           <w:bCs/>
           <w:sz w:val="32"/>
           <w:szCs w:val="32"/>
@@ -1927,9 +1927,9 @@
         <w:shd w:val="clear" w:color="auto" w:fill="FFFFFF"/>
         <w:wordWrap w:val="0"/>
         <w:spacing w:line="520" w:lineRule="exact"/>
-        <w:ind w:left="-43" w:right="-43" w:firstLineChars="100" w:firstLine="320"/>
-        <w:rPr>
-          <w:rFonts w:eastAsia="仿宋_GB2312" w:hint="eastAsia"/>
+        <w:ind w:left="-43" w:right="-43" w:firstLine="640" w:firstLineChars="100"/>
+        <w:rPr>
+          <w:rFonts w:hint="eastAsia" w:eastAsia="仿宋_GB2312"/>
           <w:bCs/>
           <w:sz w:val="32"/>
           <w:szCs w:val="32"/>
@@ -1955,7 +1955,7 @@
       </w:r>
       <w:r>
         <w:rPr>
-          <w:rFonts w:eastAsia="仿宋_GB2312" w:hint="eastAsia"/>
+          <w:rFonts w:hint="eastAsia" w:eastAsia="仿宋_GB2312"/>
           <w:bCs/>
           <w:sz w:val="32"/>
           <w:szCs w:val="32"/>
@@ -2001,25 +2001,25 @@
           <w:sz w:val="32"/>
           <w:szCs w:val="32"/>
         </w:rPr>
-        <w:t>（版本号为</w:t>
-      </w:r>
-      <w:r>
-        <w:rPr>
-          <w:rFonts w:eastAsia="仿宋_GB2312"/>
-          <w:bCs/>
-          <w:sz w:val="32"/>
-          <w:szCs w:val="32"/>
-        </w:rPr>
-        <w:t>{{software_version}}</w:t>
-      </w:r>
-      <w:r>
-        <w:rPr>
-          <w:rFonts w:eastAsia="仿宋_GB2312"/>
-          <w:bCs/>
-          <w:sz w:val="32"/>
-          <w:szCs w:val="32"/>
-        </w:rPr>
-        <w:t>）进行检查，检出{{data_summary}}等电子数据。将检出结果生成为</w:t>
+        <w:t/>
+      </w:r>
+      <w:r>
+        <w:rPr>
+          <w:rFonts w:eastAsia="仿宋_GB2312"/>
+          <w:bCs/>
+          <w:sz w:val="32"/>
+          <w:szCs w:val="32"/>
+        </w:rPr>
+        <w:t/>
+      </w:r>
+      <w:r>
+        <w:rPr>
+          <w:rFonts w:eastAsia="仿宋_GB2312"/>
+          <w:bCs/>
+          <w:sz w:val="32"/>
+          <w:szCs w:val="32"/>
+        </w:rPr>
+        <w:t>进行检查，检出{{data_summary}}等电子数据。将检出结果生成为</w:t>
       </w:r>
       <w:r>
         <w:rPr>
@@ -2197,9 +2197,9 @@
         <w:shd w:val="clear" w:color="auto" w:fill="FFFFFF"/>
         <w:wordWrap w:val="0"/>
         <w:spacing w:line="520" w:lineRule="exact"/>
-        <w:ind w:left="-43" w:right="-43" w:firstLineChars="100" w:firstLine="320"/>
-        <w:rPr>
-          <w:rFonts w:eastAsia="仿宋_GB2312" w:hint="eastAsia"/>
+        <w:ind w:left="-43" w:right="-43" w:firstLine="320" w:firstLineChars="100"/>
+        <w:rPr>
+          <w:rFonts w:hint="eastAsia" w:eastAsia="仿宋_GB2312"/>
           <w:bCs/>
           <w:sz w:val="32"/>
           <w:szCs w:val="32"/>
@@ -2211,9 +2211,9 @@
         <w:shd w:val="clear" w:color="auto" w:fill="FFFFFF"/>
         <w:wordWrap w:val="0"/>
         <w:spacing w:line="520" w:lineRule="exact"/>
-        <w:ind w:left="-43" w:right="-43" w:firstLineChars="100" w:firstLine="320"/>
-        <w:rPr>
-          <w:rFonts w:eastAsia="仿宋_GB2312" w:hint="eastAsia"/>
+        <w:ind w:left="-43" w:right="-43" w:firstLine="320" w:firstLineChars="100"/>
+        <w:rPr>
+          <w:rFonts w:hint="eastAsia" w:eastAsia="仿宋_GB2312"/>
           <w:bCs/>
           <w:sz w:val="32"/>
           <w:szCs w:val="32"/>
@@ -2225,9 +2225,9 @@
         <w:shd w:val="clear" w:color="auto" w:fill="FFFFFF"/>
         <w:wordWrap w:val="0"/>
         <w:spacing w:line="520" w:lineRule="exact"/>
-        <w:ind w:left="-43" w:right="-43" w:firstLineChars="100" w:firstLine="320"/>
-        <w:rPr>
-          <w:rFonts w:eastAsia="仿宋_GB2312" w:hint="eastAsia"/>
+        <w:ind w:left="-43" w:right="-43" w:firstLine="320" w:firstLineChars="100"/>
+        <w:rPr>
+          <w:rFonts w:hint="eastAsia" w:eastAsia="仿宋_GB2312"/>
           <w:bCs/>
           <w:sz w:val="32"/>
           <w:szCs w:val="32"/>
@@ -2239,7 +2239,7 @@
         <w:shd w:val="clear" w:color="auto" w:fill="FFFFFF"/>
         <w:wordWrap w:val="0"/>
         <w:spacing w:line="360" w:lineRule="auto"/>
-        <w:ind w:right="-54" w:left="-55"/>
+        <w:ind w:left="-55" w:right="-54"/>
         <w:rPr>
           <w:rFonts w:eastAsia="仿宋_GB2312"/>
           <w:bCs/>
@@ -2301,7 +2301,7 @@
         <w:shd w:val="clear" w:color="auto" w:fill="FFFFFF"/>
         <w:wordWrap w:val="0"/>
         <w:spacing w:line="360" w:lineRule="auto"/>
-        <w:ind w:right="-54" w:firstLineChars="300" w:firstLine="960" w:left="-55"/>
+        <w:ind w:left="-55" w:right="-54" w:firstLine="960" w:firstLineChars="300"/>
         <w:rPr>
           <w:rFonts w:eastAsia="仿宋_GB2312"/>
           <w:bCs/>
@@ -2329,7 +2329,7 @@
       </w:r>
       <w:r>
         <w:rPr>
-          <w:rFonts w:eastAsia="仿宋_GB2312" w:hint="eastAsia"/>
+          <w:rFonts w:hint="eastAsia" w:eastAsia="仿宋_GB2312"/>
           <w:bCs/>
           <w:sz w:val="32"/>
           <w:szCs w:val="32"/>
@@ -2347,7 +2347,7 @@
       </w:r>
       <w:r>
         <w:rPr>
-          <w:rFonts w:eastAsia="仿宋_GB2312" w:hint="eastAsia"/>
+          <w:rFonts w:hint="eastAsia" w:eastAsia="仿宋_GB2312"/>
           <w:bCs/>
           <w:sz w:val="32"/>
           <w:szCs w:val="32"/>
@@ -2369,7 +2369,7 @@
         <w:shd w:val="clear" w:color="auto" w:fill="FFFFFF"/>
         <w:wordWrap w:val="0"/>
         <w:spacing w:line="360" w:lineRule="auto"/>
-        <w:ind w:right="-54" w:firstLineChars="300" w:firstLine="960" w:left="-55"/>
+        <w:ind w:left="-55" w:right="-54" w:firstLine="960" w:firstLineChars="300"/>
         <w:rPr>
           <w:rFonts w:eastAsia="仿宋_GB2312"/>
           <w:bCs/>
@@ -2397,7 +2397,7 @@
       </w:r>
       <w:r>
         <w:rPr>
-          <w:rFonts w:eastAsia="仿宋_GB2312" w:hint="eastAsia"/>
+          <w:rFonts w:hint="eastAsia" w:eastAsia="仿宋_GB2312"/>
           <w:bCs/>
           <w:sz w:val="32"/>
           <w:szCs w:val="32"/>
@@ -2494,7 +2494,7 @@
         </w:tabs>
         <w:wordWrap w:val="0"/>
         <w:spacing w:line="360" w:lineRule="auto"/>
-        <w:ind w:right="-54" w:left="-55"/>
+        <w:ind w:left="-55" w:right="-54"/>
         <w:rPr>
           <w:rFonts w:eastAsia="楷体"/>
           <w:color w:val="000000"/>
@@ -2516,7 +2516,7 @@
         <w:shd w:val="clear" w:color="auto" w:fill="FFFFFF"/>
         <w:wordWrap w:val="0"/>
         <w:spacing w:line="360" w:lineRule="auto"/>
-        <w:ind w:right="-54" w:firstLineChars="300" w:firstLine="960" w:left="-55"/>
+        <w:ind w:left="-55" w:right="-54" w:firstLine="960" w:firstLineChars="300"/>
         <w:rPr>
           <w:rFonts w:eastAsia="楷体"/>
           <w:color w:val="000000"/>
@@ -2530,7 +2530,7 @@
         <w:shd w:val="clear" w:color="auto" w:fill="FFFFFF"/>
         <w:wordWrap w:val="0"/>
         <w:spacing w:line="360" w:lineRule="auto"/>
-        <w:ind w:right="-54" w:firstLineChars="1500" w:firstLine="4800" w:left="-55"/>
+        <w:ind w:left="-55" w:right="-54" w:firstLine="4800" w:firstLineChars="1500"/>
         <w:rPr>
           <w:rFonts w:eastAsia="楷体"/>
           <w:color w:val="000000"/>
@@ -2571,7 +2571,7 @@
         <w:shd w:val="clear" w:color="auto" w:fill="FFFFFF"/>
         <w:wordWrap w:val="0"/>
         <w:spacing w:line="360" w:lineRule="auto"/>
-        <w:ind w:right="-54" w:left="-55"/>
+        <w:ind w:left="-55" w:right="-54"/>
         <w:rPr>
           <w:rFonts w:eastAsia="楷体"/>
           <w:i/>
@@ -2629,7 +2629,7 @@
         </w:tabs>
         <w:wordWrap w:val="0"/>
         <w:spacing w:line="360" w:lineRule="auto"/>
-        <w:ind w:right="-54" w:left="-55"/>
+        <w:ind w:left="-55" w:right="-54"/>
         <w:rPr>
           <w:rFonts w:eastAsia="楷体"/>
           <w:i/>
@@ -2665,7 +2665,7 @@
         <w:shd w:val="clear" w:color="auto" w:fill="FFFFFF"/>
         <w:wordWrap w:val="0"/>
         <w:spacing w:line="360" w:lineRule="auto"/>
-        <w:ind w:right="-54" w:left="-55"/>
+        <w:ind w:left="-55" w:right="-54"/>
         <w:rPr>
           <w:rFonts w:eastAsia="仿宋_GB2312"/>
           <w:bCs/>
@@ -2714,39 +2714,39 @@
       </w:r>
       <w:r>
         <w:rPr>
-          <w:rFonts w:eastAsia="仿宋_GB2312" w:hint="eastAsia"/>
-          <w:bCs/>
-          <w:sz w:val="32"/>
-          <w:szCs w:val="32"/>
-        </w:rPr>
-      </w:r>
-      <w:r>
-        <w:rPr>
-          <w:rFonts w:eastAsia="仿宋_GB2312"/>
-          <w:bCs/>
-          <w:sz w:val="32"/>
-          <w:szCs w:val="32"/>
-        </w:rPr>
-      </w:r>
-      <w:r>
-        <w:rPr>
-          <w:rFonts w:eastAsia="仿宋_GB2312" w:hint="eastAsia"/>
-          <w:bCs/>
-          <w:sz w:val="32"/>
-          <w:szCs w:val="32"/>
-        </w:rPr>
-      </w:r>
-      <w:r>
-        <w:rPr>
-          <w:rFonts w:eastAsia="仿宋_GB2312"/>
-          <w:bCs/>
-          <w:sz w:val="32"/>
-          <w:szCs w:val="32"/>
-        </w:rPr>
-      </w:r>
-      <w:r>
-        <w:rPr>
-          <w:rFonts w:eastAsia="仿宋_GB2312" w:hint="eastAsia"/>
+          <w:rFonts w:hint="eastAsia" w:eastAsia="仿宋_GB2312"/>
+          <w:bCs/>
+          <w:sz w:val="32"/>
+          <w:szCs w:val="32"/>
+        </w:rPr>
+      </w:r>
+      <w:r>
+        <w:rPr>
+          <w:rFonts w:eastAsia="仿宋_GB2312"/>
+          <w:bCs/>
+          <w:sz w:val="32"/>
+          <w:szCs w:val="32"/>
+        </w:rPr>
+      </w:r>
+      <w:r>
+        <w:rPr>
+          <w:rFonts w:hint="eastAsia" w:eastAsia="仿宋_GB2312"/>
+          <w:bCs/>
+          <w:sz w:val="32"/>
+          <w:szCs w:val="32"/>
+        </w:rPr>
+      </w:r>
+      <w:r>
+        <w:rPr>
+          <w:rFonts w:eastAsia="仿宋_GB2312"/>
+          <w:bCs/>
+          <w:sz w:val="32"/>
+          <w:szCs w:val="32"/>
+        </w:rPr>
+      </w:r>
+      <w:r>
+        <w:rPr>
+          <w:rFonts w:hint="eastAsia" w:eastAsia="仿宋_GB2312"/>
           <w:bCs/>
           <w:sz w:val="32"/>
           <w:szCs w:val="32"/>
@@ -2765,7 +2765,7 @@
       <w:pPr>
         <w:shd w:val="clear" w:color="auto" w:fill="FFFFFF"/>
         <w:wordWrap w:val="0"/>
-        <w:ind w:right="-253" w:firstLine="420" w:left="-253"/>
+        <w:ind w:left="-253" w:right="-253" w:firstLine="420"/>
         <w:rPr>
           <w:rFonts w:eastAsia="楷体"/>
           <w:color w:val="000000"/>
@@ -2833,12 +2833,12 @@
         <w:tblW w:w="9594" w:type="dxa"/>
         <w:jc w:val="center"/>
         <w:tblBorders>
-          <w:top w:val="single" w:sz="4" w:space="0" w:color="auto"/>
-          <w:left w:val="single" w:sz="4" w:space="0" w:color="auto"/>
-          <w:bottom w:val="single" w:sz="4" w:space="0" w:color="auto"/>
-          <w:right w:val="single" w:sz="4" w:space="0" w:color="auto"/>
-          <w:insideH w:val="single" w:sz="4" w:space="0" w:color="auto"/>
-          <w:insideV w:val="single" w:sz="4" w:space="0" w:color="auto"/>
+          <w:top w:val="single" w:color="auto" w:sz="4" w:space="0"/>
+          <w:left w:val="single" w:color="auto" w:sz="4" w:space="0"/>
+          <w:bottom w:val="single" w:color="auto" w:sz="4" w:space="0"/>
+          <w:right w:val="single" w:color="auto" w:sz="4" w:space="0"/>
+          <w:insideH w:val="single" w:color="auto" w:sz="4" w:space="0"/>
+          <w:insideV w:val="single" w:color="auto" w:sz="4" w:space="0"/>
         </w:tblBorders>
         <w:tblLayout w:type="fixed"/>
         <w:tblLook w:val="0000" w:firstRow="0" w:lastRow="0" w:firstColumn="0" w:lastColumn="0" w:noHBand="0" w:noVBand="0"/>
@@ -2865,7 +2865,7 @@
               <w:shd w:val="clear" w:color="auto" w:fill="FFFFFF"/>
               <w:wordWrap w:val="0"/>
               <w:spacing w:line="360" w:lineRule="auto"/>
-              <w:ind w:rightChars="-52" w:right="-109"/>
+              <w:ind w:right="-109" w:rightChars="-52"/>
               <w:jc w:val="center"/>
               <w:rPr>
                 <w:rFonts w:eastAsia="仿宋_GB2312"/>
@@ -2895,7 +2895,7 @@
               <w:shd w:val="clear" w:color="auto" w:fill="FFFFFF"/>
               <w:wordWrap w:val="0"/>
               <w:spacing w:line="360" w:lineRule="auto"/>
-              <w:ind w:rightChars="-52" w:right="-109"/>
+              <w:ind w:right="-109" w:rightChars="-52"/>
               <w:jc w:val="center"/>
               <w:rPr>
                 <w:rFonts w:eastAsia="仿宋_GB2312"/>
@@ -2925,7 +2925,7 @@
               <w:shd w:val="clear" w:color="auto" w:fill="FFFFFF"/>
               <w:wordWrap w:val="0"/>
               <w:spacing w:line="360" w:lineRule="auto"/>
-              <w:ind w:rightChars="-52" w:right="-109"/>
+              <w:ind w:right="-109" w:rightChars="-52"/>
               <w:jc w:val="center"/>
               <w:rPr>
                 <w:rFonts w:eastAsia="仿宋_GB2312"/>
@@ -2955,7 +2955,7 @@
               <w:shd w:val="clear" w:color="auto" w:fill="FFFFFF"/>
               <w:wordWrap w:val="0"/>
               <w:spacing w:line="360" w:lineRule="auto"/>
-              <w:ind w:rightChars="-52" w:right="-109"/>
+              <w:ind w:right="-109" w:rightChars="-52"/>
               <w:jc w:val="center"/>
               <w:rPr>
                 <w:rFonts w:eastAsia="仿宋_GB2312"/>
@@ -2985,7 +2985,7 @@
               <w:shd w:val="clear" w:color="auto" w:fill="FFFFFF"/>
               <w:wordWrap w:val="0"/>
               <w:spacing w:line="360" w:lineRule="auto"/>
-              <w:ind w:rightChars="-52" w:right="-109"/>
+              <w:ind w:right="-109" w:rightChars="-52"/>
               <w:jc w:val="center"/>
               <w:rPr>
                 <w:rFonts w:eastAsia="仿宋_GB2312"/>
@@ -3142,7 +3142,7 @@
             </w:r>
             <w:r>
               <w:rPr>
-                <w:rFonts w:eastAsia="仿宋_GB2312" w:hint="eastAsia"/>
+                <w:rFonts w:hint="eastAsia" w:eastAsia="仿宋_GB2312"/>
                 <w:bCs/>
                 <w:color w:val="FF0000"/>
                 <w:sz w:val="32"/>
@@ -3303,7 +3303,7 @@
                 <w:sz w:val="32"/>
               </w:rPr>
               <w:pict w14:anchorId="02E9C8C5">
-                <v:line id="直线 34" o:spid="_x0000_s2082" style="position:absolute;left:0;text-align:left;flip:y;z-index:6;mso-wrap-style:square;mso-position-horizontal-relative:text;mso-position-vertical-relative:text" from="-5.85pt,1.05pt" to="472.75pt,145.7pt">
+                <v:line id="直线 34" style="position:absolute;left:0;text-align:left;flip:y;z-index:6;mso-wrap-style:square;mso-position-horizontal-relative:text;mso-position-vertical-relative:text" o:spid="_x0000_s2082" from="-5.85pt,1.05pt" to="472.75pt,145.7pt">
                   <v:fill o:detectmouseclick="t"/>
                 </v:line>
               </w:pict>
@@ -3613,7 +3613,7 @@
             </w:r>
             <w:r>
               <w:rPr>
-                <w:rFonts w:eastAsia="楷体" w:hint="eastAsia"/>
+                <w:rFonts w:hint="eastAsia" w:eastAsia="楷体"/>
                 <w:color w:val="000000"/>
                 <w:sz w:val="32"/>
                 <w:szCs w:val="32"/>
@@ -3631,7 +3631,7 @@
             </w:r>
             <w:r>
               <w:rPr>
-                <w:rFonts w:eastAsia="仿宋_GB2312" w:hint="eastAsia"/>
+                <w:rFonts w:hint="eastAsia" w:eastAsia="仿宋_GB2312"/>
                 <w:bCs/>
                 <w:sz w:val="32"/>
                 <w:szCs w:val="32"/>
@@ -3643,7 +3643,7 @@
             <w:pPr>
               <w:shd w:val="clear" w:color="auto" w:fill="FFFFFF"/>
               <w:spacing w:line="360" w:lineRule="auto"/>
-              <w:ind w:firstLineChars="2200" w:firstLine="7040"/>
+              <w:ind w:firstLine="7040" w:firstLineChars="2200"/>
               <w:rPr>
                 <w:rFonts w:eastAsia="楷体"/>
                 <w:color w:val="000000"/>
@@ -3674,7 +3674,7 @@
             <w:pPr>
               <w:shd w:val="clear" w:color="auto" w:fill="FFFFFF"/>
               <w:spacing w:line="360" w:lineRule="auto"/>
-              <w:ind w:firstLineChars="400" w:firstLine="1280"/>
+              <w:ind w:firstLine="1280" w:firstLineChars="400"/>
               <w:rPr>
                 <w:rFonts w:eastAsia="楷体"/>
                 <w:color w:val="000000"/>
@@ -3796,7 +3796,7 @@
     <w:p>
       <w:pPr>
         <w:shd w:val="clear" w:color="auto" w:fill="FFFFFF"/>
-        <w:ind w:right="-253" w:left="-253"/>
+        <w:ind w:left="-253" w:right="-253"/>
         <w:jc w:val="center"/>
         <w:rPr>
           <w:rFonts w:eastAsia="楷体"/>
@@ -3838,7 +3838,7 @@
       </w:r>
       <w:r>
         <w:rPr>
-          <w:rFonts w:eastAsia="仿宋_GB2312" w:hint="eastAsia"/>
+          <w:rFonts w:hint="eastAsia" w:eastAsia="仿宋_GB2312"/>
           <w:bCs/>
           <w:sz w:val="32"/>
           <w:szCs w:val="32"/>
@@ -3899,7 +3899,7 @@
     <w:p>
       <w:pPr>
         <w:shd w:val="clear" w:color="auto" w:fill="FFFFFF"/>
-        <w:ind w:right="-253" w:left="-253"/>
+        <w:ind w:left="-253" w:right="-253"/>
         <w:rPr>
           <w:rFonts w:eastAsia="楷体"/>
           <w:color w:val="000000"/>
@@ -3912,14 +3912,14 @@
           <w:sz w:val="32"/>
         </w:rPr>
         <w:pict w14:anchorId="5DC7EC34">
-          <v:oval id="椭圆 4" o:spid="_x0000_s2052" style="position:absolute;left:0;text-align:left;margin-left:56.9pt;margin-top:28.7pt;width:348.8pt;height:401.25pt;z-index:2;mso-wrap-style:square" filled="f" stroked="f"/>
+          <v:oval id="椭圆 4" style="position:absolute;left:0;text-align:left;margin-left:56.9pt;margin-top:28.7pt;width:348.8pt;height:401.25pt;z-index:2;mso-wrap-style:square" o:spid="_x0000_s2052" filled="f" stroked="f"/>
         </w:pict>
       </w:r>
     </w:p>
     <w:p>
       <w:pPr>
         <w:shd w:val="clear" w:color="auto" w:fill="FFFFFF"/>
-        <w:ind w:right="-253" w:left="-253"/>
+        <w:ind w:left="-253" w:right="-253"/>
         <w:rPr>
           <w:rFonts w:eastAsia="楷体"/>
           <w:color w:val="000000"/>
@@ -3931,7 +3931,7 @@
     <w:p>
       <w:pPr>
         <w:shd w:val="clear" w:color="auto" w:fill="FFFFFF"/>
-        <w:ind w:right="-253" w:left="-253"/>
+        <w:ind w:left="-253" w:right="-253"/>
         <w:rPr>
           <w:rFonts w:eastAsia="楷体"/>
           <w:color w:val="000000"/>
@@ -3943,7 +3943,7 @@
     <w:p>
       <w:pPr>
         <w:shd w:val="clear" w:color="auto" w:fill="FFFFFF"/>
-        <w:ind w:right="-253" w:left="-253"/>
+        <w:ind w:left="-253" w:right="-253"/>
         <w:jc w:val="center"/>
         <w:rPr>
           <w:rFonts w:eastAsia="楷体"/>
@@ -3957,14 +3957,14 @@
           <w:sz w:val="32"/>
         </w:rPr>
         <w:pict w14:anchorId="59BD8166">
-          <v:oval id="椭圆 5" o:spid="_x0000_s2053" style="position:absolute;left:0;text-align:left;margin-left:25.6pt;margin-top:8.15pt;width:417.9pt;height:402.2pt;z-index:3;mso-wrap-style:square" fillcolor="#f2f2f2" stroked="f"/>
+          <v:oval id="椭圆 5" style="position:absolute;left:0;text-align:left;margin-left:25.6pt;margin-top:8.15pt;width:417.9pt;height:402.2pt;z-index:3;mso-wrap-style:square" o:spid="_x0000_s2053" fillcolor="#f2f2f2" stroked="f"/>
         </w:pict>
       </w:r>
     </w:p>
     <w:p>
       <w:pPr>
         <w:shd w:val="clear" w:color="auto" w:fill="FFFFFF"/>
-        <w:ind w:right="-253" w:left="-253"/>
+        <w:ind w:left="-253" w:right="-253"/>
         <w:jc w:val="center"/>
         <w:rPr>
           <w:rFonts w:eastAsia="楷体"/>
@@ -3977,7 +3977,7 @@
     <w:p>
       <w:pPr>
         <w:shd w:val="clear" w:color="auto" w:fill="FFFFFF"/>
-        <w:ind w:right="-253" w:left="-253"/>
+        <w:ind w:left="-253" w:right="-253"/>
         <w:jc w:val="center"/>
         <w:rPr>
           <w:rFonts w:eastAsia="楷体"/>
@@ -3995,7 +3995,7 @@
             <v:stroke joinstyle="miter"/>
             <v:path gradientshapeok="t" o:connecttype="rect"/>
           </v:shapetype>
-          <v:shape id="文本框 7" o:spid="_x0000_s2055" type="#_x0000_t202" style="position:absolute;left:0;text-align:left;margin-left:121.7pt;margin-top:22.7pt;width:1in;height:1in;z-index:4;mso-wrap-style:square" filled="f" stroked="f">
+          <v:shape id="文本框 7" style="position:absolute;left:0;text-align:left;margin-left:121.7pt;margin-top:22.7pt;width:1in;height:1in;z-index:4;mso-wrap-style:square" o:spid="_x0000_s2055" filled="f" stroked="f" type="#_x0000_t202">
             <v:textbox>
               <w:txbxContent>
                 <w:p/>
@@ -4008,7 +4008,7 @@
     <w:p>
       <w:pPr>
         <w:shd w:val="clear" w:color="auto" w:fill="FFFFFF"/>
-        <w:ind w:right="-253" w:left="-253"/>
+        <w:ind w:left="-253" w:right="-253"/>
         <w:rPr>
           <w:rFonts w:eastAsia="楷体"/>
           <w:color w:val="000000"/>
@@ -4020,7 +4020,7 @@
     <w:p>
       <w:pPr>
         <w:shd w:val="clear" w:color="auto" w:fill="FFFFFF"/>
-        <w:ind w:right="-253" w:firstLineChars="1100" w:firstLine="3520" w:left="-253"/>
+        <w:ind w:left="-253" w:right="-253" w:firstLine="3520" w:firstLineChars="1100"/>
         <w:rPr>
           <w:rFonts w:eastAsia="楷体"/>
           <w:color w:val="000000"/>
@@ -4033,7 +4033,7 @@
           <w:sz w:val="32"/>
         </w:rPr>
         <w:pict w14:anchorId="41D35F53">
-          <v:shape id="文本框 6" o:spid="_x0000_s2054" type="#_x0000_t202" style="position:absolute;left:0;text-align:left;margin-left:45.45pt;margin-top:6.65pt;width:399.1pt;height:217.85pt;z-index:5;mso-wrap-style:square;v-text-anchor:top" filled="f" stroked="f">
+          <v:shape id="文本框 6" style="position:absolute;left:0;text-align:left;margin-left:45.45pt;margin-top:6.65pt;width:399.1pt;height:217.85pt;z-index:5;mso-wrap-style:square;v-text-anchor:top" o:spid="_x0000_s2054" filled="f" stroked="f" type="#_x0000_t202">
             <v:fill o:detectmouseclick="t"/>
             <v:textbox>
               <w:txbxContent>
@@ -4067,7 +4067,7 @@
                   </w:r>
                   <w:r>
                     <w:rPr>
-                      <w:rFonts w:eastAsia="仿宋_GB2312" w:hint="eastAsia"/>
+                      <w:rFonts w:hint="eastAsia" w:eastAsia="仿宋_GB2312"/>
                       <w:bCs/>
                       <w:color w:val="FF0000"/>
                       <w:sz w:val="32"/>
@@ -4164,7 +4164,7 @@
                   </w:r>
                   <w:r>
                     <w:rPr>
-                      <w:rFonts w:eastAsia="仿宋_GB2312" w:hint="eastAsia"/>
+                      <w:rFonts w:hint="eastAsia" w:eastAsia="仿宋_GB2312"/>
                       <w:bCs/>
                       <w:color w:val="FF0000"/>
                       <w:sz w:val="32"/>
@@ -4183,7 +4183,7 @@
                   </w:r>
                   <w:r>
                     <w:rPr>
-                      <w:rFonts w:eastAsia="仿宋_GB2312" w:hint="eastAsia"/>
+                      <w:rFonts w:hint="eastAsia" w:eastAsia="仿宋_GB2312"/>
                       <w:bCs/>
                       <w:color w:val="FF0000"/>
                       <w:sz w:val="32"/>
@@ -4202,7 +4202,7 @@
                   </w:r>
                   <w:r>
                     <w:rPr>
-                      <w:rFonts w:eastAsia="仿宋_GB2312" w:hint="eastAsia"/>
+                      <w:rFonts w:hint="eastAsia" w:eastAsia="仿宋_GB2312"/>
                       <w:bCs/>
                       <w:color w:val="FF0000"/>
                       <w:sz w:val="32"/>
@@ -4223,7 +4223,7 @@
                 <w:p>
                   <w:pPr>
                     <w:rPr>
-                      <w:rFonts w:ascii="微软雅黑" w:eastAsia="微软雅黑" w:hAnsi="微软雅黑" w:cs="微软雅黑" w:hint="eastAsia"/>
+                      <w:rFonts w:hint="eastAsia" w:ascii="微软雅黑" w:hAnsi="微软雅黑" w:eastAsia="微软雅黑" w:cs="微软雅黑"/>
                       <w:color w:val="171A1D"/>
                       <w:szCs w:val="21"/>
                       <w:shd w:val="clear" w:color="auto" w:fill="FFFFFF"/>
@@ -4239,7 +4239,7 @@
     <w:p>
       <w:pPr>
         <w:shd w:val="clear" w:color="auto" w:fill="FFFFFF"/>
-        <w:ind w:right="-253" w:firstLineChars="1100" w:firstLine="3520" w:left="-253"/>
+        <w:ind w:left="-253" w:right="-253" w:firstLine="3520" w:firstLineChars="1100"/>
         <w:rPr>
           <w:rFonts w:eastAsia="楷体"/>
           <w:color w:val="000000"/>
@@ -4251,7 +4251,7 @@
     <w:p>
       <w:pPr>
         <w:shd w:val="clear" w:color="auto" w:fill="FFFFFF"/>
-        <w:ind w:right="-253" w:firstLineChars="1200" w:firstLine="3840" w:left="-253"/>
+        <w:ind w:left="-253" w:right="-253" w:firstLine="3840" w:firstLineChars="1200"/>
         <w:rPr>
           <w:rFonts w:eastAsia="楷体"/>
           <w:color w:val="000000"/>
@@ -4271,7 +4271,7 @@
     <w:p>
       <w:pPr>
         <w:shd w:val="clear" w:color="auto" w:fill="FFFFFF"/>
-        <w:ind w:right="-253" w:left="-253"/>
+        <w:ind w:left="-253" w:right="-253"/>
         <w:jc w:val="center"/>
         <w:rPr>
           <w:rFonts w:eastAsia="楷体"/>
@@ -4284,7 +4284,7 @@
     <w:p>
       <w:pPr>
         <w:shd w:val="clear" w:color="auto" w:fill="FFFFFF"/>
-        <w:ind w:right="-253" w:left="-253"/>
+        <w:ind w:left="-253" w:right="-253"/>
         <w:jc w:val="center"/>
         <w:rPr>
           <w:rFonts w:eastAsia="楷体"/>
@@ -4297,7 +4297,7 @@
     <w:p>
       <w:pPr>
         <w:shd w:val="clear" w:color="auto" w:fill="FFFFFF"/>
-        <w:ind w:right="-253" w:left="-253"/>
+        <w:ind w:left="-253" w:right="-253"/>
         <w:jc w:val="center"/>
         <w:rPr>
           <w:rFonts w:eastAsia="楷体"/>
@@ -4310,7 +4310,7 @@
     <w:p>
       <w:pPr>
         <w:shd w:val="clear" w:color="auto" w:fill="FFFFFF"/>
-        <w:ind w:right="-253" w:left="-253"/>
+        <w:ind w:left="-253" w:right="-253"/>
         <w:jc w:val="center"/>
         <w:rPr>
           <w:rFonts w:eastAsia="楷体"/>
@@ -4326,7 +4326,7 @@
         <w:tabs>
           <w:tab w:val="left" w:pos="919"/>
         </w:tabs>
-        <w:ind w:right="-253" w:left="-253"/>
+        <w:ind w:left="-253" w:right="-253"/>
         <w:jc w:val="left"/>
         <w:rPr>
           <w:rFonts w:eastAsia="楷体"/>
@@ -4350,7 +4350,7 @@
         <w:tabs>
           <w:tab w:val="left" w:pos="1308"/>
         </w:tabs>
-        <w:ind w:right="-253" w:left="-253"/>
+        <w:ind w:left="-253" w:right="-253"/>
         <w:jc w:val="left"/>
         <w:rPr>
           <w:rFonts w:eastAsia="楷体"/>
@@ -4371,7 +4371,7 @@
     <w:p>
       <w:pPr>
         <w:shd w:val="clear" w:color="auto" w:fill="FFFFFF"/>
-        <w:ind w:right="-253" w:left="-253"/>
+        <w:ind w:left="-253" w:right="-253"/>
         <w:jc w:val="center"/>
         <w:rPr>
           <w:rFonts w:eastAsia="楷体"/>
@@ -4384,7 +4384,7 @@
     <w:p>
       <w:pPr>
         <w:shd w:val="clear" w:color="auto" w:fill="FFFFFF"/>
-        <w:ind w:right="-253" w:left="-253"/>
+        <w:ind w:left="-253" w:right="-253"/>
         <w:jc w:val="center"/>
         <w:rPr>
           <w:rFonts w:eastAsia="楷体"/>
@@ -4400,7 +4400,7 @@
         <w:tabs>
           <w:tab w:val="left" w:pos="5983"/>
         </w:tabs>
-        <w:ind w:right="-253" w:left="-253"/>
+        <w:ind w:left="-253" w:right="-253"/>
         <w:jc w:val="left"/>
         <w:rPr>
           <w:rFonts w:eastAsia="楷体"/>
@@ -4439,7 +4439,7 @@
       </w:r>
       <w:r>
         <w:rPr>
-          <w:rFonts w:eastAsia="仿宋_GB2312" w:hint="eastAsia"/>
+          <w:rFonts w:hint="eastAsia" w:eastAsia="仿宋_GB2312"/>
           <w:bCs/>
           <w:sz w:val="32"/>
           <w:szCs w:val="32"/>
@@ -4518,7 +4518,7 @@
     </w:pPr>
     <w:r>
       <w:pict w14:anchorId="7EB3505F">
-        <v:rect id="文本框13" o:spid="_x0000_s1025" style="position:absolute;margin-left:5in;margin-top:10.3pt;width:93.5pt;height:13.6pt;z-index:3;mso-wrap-style:square;mso-position-horizontal-relative:margin" filled="f" stroked="f">
+        <v:rect id="文本框13" style="position:absolute;margin-left:5in;margin-top:10.3pt;width:93.5pt;height:13.6pt;z-index:3;mso-wrap-style:square;mso-position-horizontal-relative:margin" o:spid="_x0000_s1025" filled="f" stroked="f">
           <v:textbox inset="0,0,0,0">
             <w:txbxContent>
               <w:p>
@@ -4528,7 +4528,7 @@
                 </w:pPr>
                 <w:r>
                   <w:rPr>
-                    <w:rFonts w:ascii="仿宋_GB2312" w:eastAsia="仿宋_GB2312" w:hint="eastAsia"/>
+                    <w:rFonts w:hint="eastAsia" w:ascii="仿宋_GB2312" w:eastAsia="仿宋_GB2312"/>
                     <w:sz w:val="21"/>
                     <w:szCs w:val="21"/>
                   </w:rPr>
@@ -4576,7 +4576,7 @@
                 </w:r>
                 <w:r>
                   <w:rPr>
-                    <w:rFonts w:ascii="仿宋_GB2312" w:eastAsia="仿宋_GB2312" w:hint="eastAsia"/>
+                    <w:rFonts w:hint="eastAsia" w:ascii="仿宋_GB2312" w:eastAsia="仿宋_GB2312"/>
                     <w:sz w:val="21"/>
                     <w:szCs w:val="21"/>
                   </w:rPr>
@@ -4624,7 +4624,7 @@
                 </w:r>
                 <w:r>
                   <w:rPr>
-                    <w:rFonts w:ascii="仿宋_GB2312" w:eastAsia="仿宋_GB2312" w:hint="eastAsia"/>
+                    <w:rFonts w:hint="eastAsia" w:ascii="仿宋_GB2312" w:eastAsia="仿宋_GB2312"/>
                     <w:sz w:val="21"/>
                     <w:szCs w:val="21"/>
                   </w:rPr>
@@ -4642,7 +4642,7 @@
         <w:rFonts w:hint="eastAsia"/>
       </w:rPr>
       <w:pict w14:anchorId="401F510F">
-        <v:line id="Line 2" o:spid="_x0000_s1048" style="position:absolute;z-index:1;mso-wrap-style:square" from="-32.95pt,4pt" to="469.55pt,4pt" strokeweight="4.5pt">
+        <v:line id="Line 2" style="position:absolute;z-index:1;mso-wrap-style:square" o:spid="_x0000_s1048" strokeweight="4.5pt" from="-32.95pt,4pt" to="469.55pt,4pt">
           <v:stroke linestyle="thinThick"/>
         </v:line>
       </w:pict>
@@ -4659,7 +4659,7 @@
     </w:pPr>
     <w:r>
       <w:rPr>
-        <w:rFonts w:ascii="仿宋_GB2312" w:eastAsia="仿宋_GB2312" w:hint="eastAsia"/>
+        <w:rFonts w:hint="eastAsia" w:ascii="仿宋_GB2312" w:eastAsia="仿宋_GB2312"/>
         <w:sz w:val="21"/>
         <w:szCs w:val="21"/>
       </w:rPr>
@@ -4675,19 +4675,19 @@
     <w:pPr>
       <w:pStyle w:val="a8"/>
       <w:rPr>
-        <w:rFonts w:ascii="仿宋_GB2312" w:eastAsia="仿宋_GB2312" w:hint="eastAsia"/>
+        <w:rFonts w:hint="eastAsia" w:ascii="仿宋_GB2312" w:eastAsia="仿宋_GB2312"/>
         <w:sz w:val="21"/>
         <w:szCs w:val="21"/>
       </w:rPr>
     </w:pPr>
     <w:r>
       <w:rPr>
-        <w:rFonts w:ascii="仿宋_GB2312" w:eastAsia="仿宋_GB2312" w:hint="eastAsia"/>
+        <w:rFonts w:hint="eastAsia" w:ascii="仿宋_GB2312" w:eastAsia="仿宋_GB2312"/>
         <w:sz w:val="21"/>
         <w:szCs w:val="21"/>
       </w:rPr>
       <w:pict w14:anchorId="0C7592BB">
-        <v:line id="Line 3" o:spid="_x0000_s1046" style="position:absolute;z-index:2;mso-wrap-style:square" from="-24.7pt,5.8pt" to="461.3pt,5.8pt" strokeweight="4.5pt">
+        <v:line id="Line 3" style="position:absolute;z-index:2;mso-wrap-style:square" o:spid="_x0000_s1046" strokeweight="4.5pt" from="-24.7pt,5.8pt" to="461.3pt,5.8pt">
           <v:stroke linestyle="thinThick"/>
         </v:line>
       </w:pict>
@@ -4700,7 +4700,7 @@
     </w:pPr>
     <w:r>
       <w:rPr>
-        <w:rFonts w:ascii="仿宋_GB2312" w:eastAsia="仿宋_GB2312" w:hint="eastAsia"/>
+        <w:rFonts w:hint="eastAsia" w:ascii="仿宋_GB2312" w:eastAsia="仿宋_GB2312"/>
         <w:sz w:val="21"/>
         <w:szCs w:val="21"/>
       </w:rPr>
@@ -4748,7 +4748,7 @@
     </w:r>
     <w:r>
       <w:rPr>
-        <w:rFonts w:ascii="仿宋_GB2312" w:eastAsia="仿宋_GB2312" w:hint="eastAsia"/>
+        <w:rFonts w:hint="eastAsia" w:ascii="仿宋_GB2312" w:eastAsia="仿宋_GB2312"/>
         <w:sz w:val="21"/>
         <w:szCs w:val="21"/>
       </w:rPr>
@@ -4796,7 +4796,7 @@
     </w:r>
     <w:r>
       <w:rPr>
-        <w:rFonts w:ascii="仿宋_GB2312" w:eastAsia="仿宋_GB2312" w:hint="eastAsia"/>
+        <w:rFonts w:hint="eastAsia" w:ascii="仿宋_GB2312" w:eastAsia="仿宋_GB2312"/>
         <w:sz w:val="21"/>
         <w:szCs w:val="21"/>
       </w:rPr>
@@ -4808,7 +4808,7 @@
       <w:pStyle w:val="a8"/>
       <w:jc w:val="both"/>
       <w:rPr>
-        <w:rFonts w:ascii="仿宋_GB2312" w:eastAsia="仿宋_GB2312" w:hint="eastAsia"/>
+        <w:rFonts w:hint="eastAsia" w:ascii="仿宋_GB2312" w:eastAsia="仿宋_GB2312"/>
         <w:sz w:val="21"/>
         <w:szCs w:val="21"/>
       </w:rPr>
@@ -4858,7 +4858,7 @@
     <w:pPr>
       <w:pStyle w:val="aa"/>
       <w:rPr>
-        <w:rFonts w:eastAsia="仿宋_GB2312" w:hint="eastAsia"/>
+        <w:rFonts w:hint="eastAsia" w:eastAsia="仿宋_GB2312"/>
         <w:spacing w:val="-20"/>
         <w:sz w:val="21"/>
         <w:szCs w:val="30"/>
@@ -4866,7 +4866,7 @@
     </w:pPr>
     <w:r>
       <w:rPr>
-        <w:rFonts w:eastAsia="仿宋_GB2312" w:hint="eastAsia"/>
+        <w:rFonts w:hint="eastAsia" w:eastAsia="仿宋_GB2312"/>
         <w:spacing w:val="-20"/>
         <w:sz w:val="30"/>
         <w:szCs w:val="30"/>
@@ -4875,7 +4875,7 @@
     </w:r>
     <w:r>
       <w:rPr>
-        <w:rFonts w:eastAsia="仿宋_GB2312" w:hint="eastAsia"/>
+        <w:rFonts w:hint="eastAsia" w:eastAsia="仿宋_GB2312"/>
         <w:spacing w:val="-20"/>
         <w:sz w:val="21"/>
         <w:szCs w:val="30"/>
@@ -4892,7 +4892,7 @@
     </w:r>
     <w:r>
       <w:rPr>
-        <w:rFonts w:eastAsia="仿宋_GB2312" w:hint="eastAsia"/>
+        <w:rFonts w:hint="eastAsia" w:eastAsia="仿宋_GB2312"/>
         <w:spacing w:val="-20"/>
         <w:sz w:val="21"/>
         <w:szCs w:val="30"/>
@@ -4908,7 +4908,7 @@
     </w:r>
     <w:r>
       <w:rPr>
-        <w:rFonts w:eastAsia="仿宋_GB2312" w:hint="eastAsia"/>
+        <w:rFonts w:hint="eastAsia" w:eastAsia="仿宋_GB2312"/>
         <w:spacing w:val="-20"/>
         <w:sz w:val="21"/>
         <w:szCs w:val="30"/>
@@ -4951,7 +4951,7 @@
   <w:docDefaults>
     <w:rPrDefault>
       <w:rPr>
-        <w:rFonts w:ascii="Times New Roman" w:eastAsia="宋体" w:hAnsi="Times New Roman" w:cs="Times New Roman"/>
+        <w:rFonts w:ascii="Times New Roman" w:hAnsi="Times New Roman" w:eastAsia="宋体" w:cs="Times New Roman"/>
         <w:lang w:val="en-US" w:eastAsia="zh-CN" w:bidi="ar-SA"/>
       </w:rPr>
     </w:rPrDefault>
@@ -4960,14 +4960,14 @@
   <w:latentStyles w:defLockedState="0" w:defUIPriority="99" w:defSemiHidden="0" w:defUnhideWhenUsed="0" w:defQFormat="0" w:count="376">
     <w:lsdException w:name="Normal" w:uiPriority="0" w:qFormat="1"/>
     <w:lsdException w:name="heading 1" w:uiPriority="9" w:qFormat="1"/>
-    <w:lsdException w:name="heading 2" w:semiHidden="1" w:uiPriority="9" w:unhideWhenUsed="1" w:qFormat="1"/>
-    <w:lsdException w:name="heading 3" w:semiHidden="1" w:uiPriority="9" w:unhideWhenUsed="1" w:qFormat="1"/>
-    <w:lsdException w:name="heading 4" w:semiHidden="1" w:uiPriority="9" w:unhideWhenUsed="1" w:qFormat="1"/>
-    <w:lsdException w:name="heading 5" w:semiHidden="1" w:uiPriority="9" w:unhideWhenUsed="1" w:qFormat="1"/>
-    <w:lsdException w:name="heading 6" w:semiHidden="1" w:uiPriority="9" w:unhideWhenUsed="1" w:qFormat="1"/>
-    <w:lsdException w:name="heading 7" w:semiHidden="1" w:uiPriority="9" w:unhideWhenUsed="1" w:qFormat="1"/>
-    <w:lsdException w:name="heading 8" w:semiHidden="1" w:uiPriority="9" w:unhideWhenUsed="1" w:qFormat="1"/>
-    <w:lsdException w:name="heading 9" w:semiHidden="1" w:uiPriority="9" w:unhideWhenUsed="1" w:qFormat="1"/>
+    <w:lsdException w:name="heading 2" w:uiPriority="9" w:semiHidden="1" w:unhideWhenUsed="1" w:qFormat="1"/>
+    <w:lsdException w:name="heading 3" w:uiPriority="9" w:semiHidden="1" w:unhideWhenUsed="1" w:qFormat="1"/>
+    <w:lsdException w:name="heading 4" w:uiPriority="9" w:semiHidden="1" w:unhideWhenUsed="1" w:qFormat="1"/>
+    <w:lsdException w:name="heading 5" w:uiPriority="9" w:semiHidden="1" w:unhideWhenUsed="1" w:qFormat="1"/>
+    <w:lsdException w:name="heading 6" w:uiPriority="9" w:semiHidden="1" w:unhideWhenUsed="1" w:qFormat="1"/>
+    <w:lsdException w:name="heading 7" w:uiPriority="9" w:semiHidden="1" w:unhideWhenUsed="1" w:qFormat="1"/>
+    <w:lsdException w:name="heading 8" w:uiPriority="9" w:semiHidden="1" w:unhideWhenUsed="1" w:qFormat="1"/>
+    <w:lsdException w:name="heading 9" w:uiPriority="9" w:semiHidden="1" w:unhideWhenUsed="1" w:qFormat="1"/>
     <w:lsdException w:name="index 1" w:semiHidden="1" w:unhideWhenUsed="1"/>
     <w:lsdException w:name="index 2" w:semiHidden="1" w:unhideWhenUsed="1"/>
     <w:lsdException w:name="index 3" w:semiHidden="1" w:unhideWhenUsed="1"/>
@@ -4977,22 +4977,22 @@
     <w:lsdException w:name="index 7" w:semiHidden="1" w:unhideWhenUsed="1"/>
     <w:lsdException w:name="index 8" w:semiHidden="1" w:unhideWhenUsed="1"/>
     <w:lsdException w:name="index 9" w:semiHidden="1" w:unhideWhenUsed="1"/>
-    <w:lsdException w:name="toc 1" w:semiHidden="1" w:uiPriority="39" w:unhideWhenUsed="1"/>
-    <w:lsdException w:name="toc 2" w:semiHidden="1" w:uiPriority="39" w:unhideWhenUsed="1"/>
-    <w:lsdException w:name="toc 3" w:semiHidden="1" w:uiPriority="39" w:unhideWhenUsed="1"/>
-    <w:lsdException w:name="toc 4" w:semiHidden="1" w:uiPriority="39" w:unhideWhenUsed="1"/>
-    <w:lsdException w:name="toc 5" w:semiHidden="1" w:uiPriority="39" w:unhideWhenUsed="1"/>
-    <w:lsdException w:name="toc 6" w:semiHidden="1" w:uiPriority="39" w:unhideWhenUsed="1"/>
-    <w:lsdException w:name="toc 7" w:semiHidden="1" w:uiPriority="39" w:unhideWhenUsed="1"/>
-    <w:lsdException w:name="toc 8" w:semiHidden="1" w:uiPriority="39" w:unhideWhenUsed="1"/>
-    <w:lsdException w:name="toc 9" w:semiHidden="1" w:uiPriority="39" w:unhideWhenUsed="1"/>
+    <w:lsdException w:name="toc 1" w:uiPriority="39" w:semiHidden="1" w:unhideWhenUsed="1"/>
+    <w:lsdException w:name="toc 2" w:uiPriority="39" w:semiHidden="1" w:unhideWhenUsed="1"/>
+    <w:lsdException w:name="toc 3" w:uiPriority="39" w:semiHidden="1" w:unhideWhenUsed="1"/>
+    <w:lsdException w:name="toc 4" w:uiPriority="39" w:semiHidden="1" w:unhideWhenUsed="1"/>
+    <w:lsdException w:name="toc 5" w:uiPriority="39" w:semiHidden="1" w:unhideWhenUsed="1"/>
+    <w:lsdException w:name="toc 6" w:uiPriority="39" w:semiHidden="1" w:unhideWhenUsed="1"/>
+    <w:lsdException w:name="toc 7" w:uiPriority="39" w:semiHidden="1" w:unhideWhenUsed="1"/>
+    <w:lsdException w:name="toc 8" w:uiPriority="39" w:semiHidden="1" w:unhideWhenUsed="1"/>
+    <w:lsdException w:name="toc 9" w:uiPriority="39" w:semiHidden="1" w:unhideWhenUsed="1"/>
     <w:lsdException w:name="Normal Indent" w:semiHidden="1" w:unhideWhenUsed="1"/>
     <w:lsdException w:name="footnote text" w:semiHidden="1" w:unhideWhenUsed="1"/>
     <w:lsdException w:name="annotation text" w:semiHidden="1" w:unhideWhenUsed="1"/>
     <w:lsdException w:name="header" w:unhideWhenUsed="1"/>
     <w:lsdException w:name="footer" w:unhideWhenUsed="1"/>
     <w:lsdException w:name="index heading" w:semiHidden="1" w:unhideWhenUsed="1"/>
-    <w:lsdException w:name="caption" w:semiHidden="1" w:uiPriority="35" w:unhideWhenUsed="1" w:qFormat="1"/>
+    <w:lsdException w:name="caption" w:uiPriority="35" w:semiHidden="1" w:unhideWhenUsed="1" w:qFormat="1"/>
     <w:lsdException w:name="table of figures" w:semiHidden="1" w:unhideWhenUsed="1"/>
     <w:lsdException w:name="envelope address" w:semiHidden="1" w:unhideWhenUsed="1"/>
     <w:lsdException w:name="envelope return" w:semiHidden="1" w:unhideWhenUsed="1"/>
@@ -5223,8 +5223,8 @@
     <w:lsdException w:name="Subtle Reference" w:uiPriority="31" w:qFormat="1"/>
     <w:lsdException w:name="Intense Reference" w:uiPriority="32" w:qFormat="1"/>
     <w:lsdException w:name="Book Title" w:uiPriority="33" w:qFormat="1"/>
-    <w:lsdException w:name="Bibliography" w:semiHidden="1" w:uiPriority="37" w:unhideWhenUsed="1"/>
-    <w:lsdException w:name="TOC Heading" w:semiHidden="1" w:uiPriority="39" w:unhideWhenUsed="1" w:qFormat="1"/>
+    <w:lsdException w:name="Bibliography" w:uiPriority="37" w:semiHidden="1" w:unhideWhenUsed="1"/>
+    <w:lsdException w:name="TOC Heading" w:uiPriority="39" w:semiHidden="1" w:unhideWhenUsed="1" w:qFormat="1"/>
     <w:lsdException w:name="Plain Table 1" w:uiPriority="41"/>
     <w:lsdException w:name="Plain Table 2" w:uiPriority="42"/>
     <w:lsdException w:name="Plain Table 3" w:uiPriority="43"/>
@@ -5335,7 +5335,7 @@
     <w:lsdException w:name="Unresolved Mention" w:semiHidden="1" w:unhideWhenUsed="1"/>
     <w:lsdException w:name="Smart Link" w:semiHidden="1" w:unhideWhenUsed="1"/>
   </w:latentStyles>
-  <w:style w:type="paragraph" w:default="1" w:styleId="a">
+  <w:style w:type="paragraph" w:styleId="a" w:default="1">
     <w:name w:val="Normal"/>
     <w:qFormat/>
     <w:pPr>
@@ -5348,12 +5348,12 @@
       <w:szCs w:val="24"/>
     </w:rPr>
   </w:style>
-  <w:style w:type="character" w:default="1" w:styleId="a0">
+  <w:style w:type="character" w:styleId="a0" w:default="1">
     <w:name w:val="Default Paragraph Font"/>
     <w:uiPriority w:val="1"/>
     <w:unhideWhenUsed/>
   </w:style>
-  <w:style w:type="table" w:default="1" w:styleId="a1">
+  <w:style w:type="table" w:styleId="a1" w:default="1">
     <w:name w:val="Normal Table"/>
     <w:uiPriority w:val="99"/>
     <w:unhideWhenUsed/>
@@ -5366,7 +5366,7 @@
       </w:tblCellMar>
     </w:tblPr>
   </w:style>
-  <w:style w:type="numbering" w:default="1" w:styleId="a2">
+  <w:style w:type="numbering" w:styleId="a2" w:default="1">
     <w:name w:val="No List"/>
     <w:uiPriority w:val="99"/>
     <w:semiHidden/>
@@ -5392,7 +5392,7 @@
       <w:jc w:val="left"/>
     </w:pPr>
   </w:style>
-  <w:style w:type="character" w:customStyle="1" w:styleId="a5">
+  <w:style w:type="character" w:styleId="a5" w:customStyle="1">
     <w:name w:val="尾注文本 字符"/>
     <w:link w:val="a4"/>
     <w:uiPriority w:val="99"/>
@@ -5415,13 +5415,13 @@
       <w:szCs w:val="18"/>
     </w:rPr>
   </w:style>
-  <w:style w:type="character" w:customStyle="1" w:styleId="a7">
+  <w:style w:type="character" w:styleId="a7" w:customStyle="1">
     <w:name w:val="批注框文本 字符"/>
     <w:link w:val="a6"/>
     <w:uiPriority w:val="99"/>
     <w:semiHidden/>
     <w:rPr>
-      <w:rFonts w:ascii="Times New Roman" w:eastAsia="宋体" w:hAnsi="Times New Roman" w:cs="Times New Roman"/>
+      <w:rFonts w:ascii="Times New Roman" w:hAnsi="Times New Roman" w:eastAsia="宋体" w:cs="Times New Roman"/>
       <w:sz w:val="18"/>
       <w:szCs w:val="18"/>
     </w:rPr>
@@ -5446,7 +5446,7 @@
       <w:szCs w:val="18"/>
     </w:rPr>
   </w:style>
-  <w:style w:type="character" w:customStyle="1" w:styleId="a9">
+  <w:style w:type="character" w:styleId="a9" w:customStyle="1">
     <w:name w:val="页脚 字符"/>
     <w:link w:val="a8"/>
     <w:uiPriority w:val="99"/>
@@ -5464,7 +5464,7 @@
     <w:unhideWhenUsed/>
     <w:pPr>
       <w:pBdr>
-        <w:bottom w:val="single" w:sz="6" w:space="1" w:color="auto"/>
+        <w:bottom w:val="single" w:color="auto" w:sz="6" w:space="1"/>
       </w:pBdr>
       <w:tabs>
         <w:tab w:val="center" w:pos="4153"/>
@@ -5479,7 +5479,7 @@
       <w:szCs w:val="18"/>
     </w:rPr>
   </w:style>
-  <w:style w:type="character" w:customStyle="1" w:styleId="ab">
+  <w:style w:type="character" w:styleId="ab" w:customStyle="1">
     <w:name w:val="页眉 字符"/>
     <w:link w:val="aa"/>
     <w:uiPriority w:val="99"/>
@@ -5541,7 +5541,7 @@
     <w:uiPriority w:val="99"/>
     <w:unhideWhenUsed/>
     <w:rPr>
-      <w:rFonts w:ascii="Consolas" w:eastAsia="Consolas" w:hAnsi="Consolas" w:cs="Consolas" w:hint="default"/>
+      <w:rFonts w:hint="default" w:ascii="Consolas" w:hAnsi="Consolas" w:eastAsia="Consolas" w:cs="Consolas"/>
       <w:color w:val="E83E8C"/>
       <w:sz w:val="21"/>
       <w:szCs w:val="21"/>
@@ -5552,7 +5552,7 @@
     <w:uiPriority w:val="99"/>
     <w:unhideWhenUsed/>
     <w:rPr>
-      <w:rFonts w:ascii="Consolas" w:eastAsia="Consolas" w:hAnsi="Consolas" w:cs="Consolas"/>
+      <w:rFonts w:ascii="Consolas" w:hAnsi="Consolas" w:eastAsia="Consolas" w:cs="Consolas"/>
       <w:color w:val="FFFFFF"/>
       <w:sz w:val="21"/>
       <w:szCs w:val="21"/>
@@ -5564,18 +5564,18 @@
     <w:uiPriority w:val="99"/>
     <w:unhideWhenUsed/>
     <w:rPr>
-      <w:rFonts w:ascii="Consolas" w:eastAsia="Consolas" w:hAnsi="Consolas" w:cs="Consolas" w:hint="default"/>
+      <w:rFonts w:hint="default" w:ascii="Consolas" w:hAnsi="Consolas" w:eastAsia="Consolas" w:cs="Consolas"/>
       <w:sz w:val="21"/>
       <w:szCs w:val="21"/>
     </w:rPr>
   </w:style>
-  <w:style w:type="character" w:customStyle="1" w:styleId="button">
+  <w:style w:type="character" w:styleId="button" w:customStyle="1">
     <w:name w:val="button"/>
   </w:style>
-  <w:style w:type="character" w:customStyle="1" w:styleId="tmpztreemovearrow">
+  <w:style w:type="character" w:styleId="tmpztreemovearrow" w:customStyle="1">
     <w:name w:val="tmpztreemove_arrow"/>
   </w:style>
-  <w:style w:type="paragraph" w:customStyle="1" w:styleId="Char">
+  <w:style w:type="paragraph" w:styleId="Char" w:customStyle="1">
     <w:name w:val=" Char"/>
     <w:basedOn w:val="a"/>
     <w:pPr>
@@ -5584,7 +5584,7 @@
       <w:jc w:val="left"/>
     </w:pPr>
     <w:rPr>
-      <w:rFonts w:ascii="Verdana" w:eastAsia="仿宋_GB2312" w:hAnsi="Verdana" w:cs="Verdana"/>
+      <w:rFonts w:ascii="Verdana" w:hAnsi="Verdana" w:eastAsia="仿宋_GB2312" w:cs="Verdana"/>
       <w:kern w:val="0"/>
       <w:sz w:val="30"/>
       <w:szCs w:val="30"/>
@@ -5597,7 +5597,7 @@
     <w:uiPriority w:val="34"/>
     <w:qFormat/>
     <w:pPr>
-      <w:ind w:firstLineChars="200" w:firstLine="420"/>
+      <w:ind w:firstLine="420" w:firstLineChars="200"/>
     </w:pPr>
   </w:style>
 </w:styles>

</xml_diff>

<commit_message>
fix: align Word export signature and document number
</commit_message>
<xml_diff>
--- a/word_templates/template.docx
+++ b/word_templates/template.docx
@@ -39,6 +39,7 @@
       <w:pPr>
         <w:shd w:val="clear" w:color="auto" w:fill="FFFFFF"/>
         <w:ind w:left="-253" w:right="-253"/>
+        <w:jc w:val="right"/>
         <w:rPr>
           <w:rFonts w:eastAsia="仿宋_GB2312"/>
           <w:bCs/>
@@ -65,7 +66,7 @@
           <w:sz w:val="36"/>
           <w:szCs w:val="36"/>
         </w:rPr>
-        <w:t xml:space="preserve">                            </w:t>
+        <w:t xml:space="preserve"/>
       </w:r>
       <w:r>
         <w:rPr>
@@ -75,7 +76,7 @@
           <w:sz w:val="36"/>
           <w:szCs w:val="36"/>
         </w:rPr>
-        <w:t xml:space="preserve">  </w:t>
+        <w:t xml:space="preserve"/>
       </w:r>
       <w:r>
         <w:rPr>
@@ -85,7 +86,7 @@
           <w:sz w:val="36"/>
           <w:szCs w:val="36"/>
         </w:rPr>
-        <w:t xml:space="preserve">  </w:t>
+        <w:t xml:space="preserve"/>
       </w:r>
       <w:r>
         <w:rPr>

</xml_diff>